<commit_message>
docs(p2p): finalize all reviewer and editorial responses in P2P_response_LLM4AE.docx
</commit_message>
<xml_diff>
--- a/publication/manuscripts/P2P_response_LLM4AE.docx
+++ b/publication/manuscripts/P2P_response_LLM4AE.docx
@@ -212,21 +212,26 @@
               <w:bottom w:w="120" w:type="dxa"/>
               <w:right w:w="140" w:type="dxa"/>
             </w:tcMar>
+            <w:shd w:fill="FAFAFA"/>
+            <w:tcMar>
+              <w:top w:w="120" w:type="dxa"/>
+              <w:bottom w:w="120" w:type="dxa"/>
+              <w:left w:w="180" w:type="dxa"/>
+              <w:right w:w="180" w:type="dxa"/>
+            </w:tcMar>
           </w:tcPr>
           <w:p>
             <w:pPr>
-              <w:spacing w:after="0"/>
-              <w:rPr>
-                <w:i/>
-                <w:color w:val="7030A0"/>
-              </w:rPr>
+              <w:spacing w:before="60" w:after="80" w:line="276" w:lineRule="auto"/>
             </w:pPr>
+            <w:r/>
             <w:r>
               <w:rPr>
-                <w:i/>
-                <w:color w:val="7030A0"/>
+                <w:rFonts w:ascii="Arial" w:hAnsi="Arial"/>
+                <w:color w:val="222222"/>
+                <w:sz w:val="19"/>
               </w:rPr>
-              <w:t>Fixed.</w:t>
+              <w:t>We thank the reviewer for pointing this out. We have revised the Abstract to explicitly define all acronyms upon first mention: FDA Adverse Event Reporting System (FAERS), Vaccine Adverse Event Reporting System (VAERS), Named Entity Recognition (NER), Individual Case Safety Reports (ICSRs), and Large Language Models (LLMs).</w:t>
             </w:r>
           </w:p>
         </w:tc>
@@ -326,15 +331,40 @@
               <w:bottom w:w="120" w:type="dxa"/>
               <w:right w:w="140" w:type="dxa"/>
             </w:tcMar>
+            <w:shd w:fill="FAFAFA"/>
+            <w:tcMar>
+              <w:top w:w="120" w:type="dxa"/>
+              <w:bottom w:w="120" w:type="dxa"/>
+              <w:left w:w="180" w:type="dxa"/>
+              <w:right w:w="180" w:type="dxa"/>
+            </w:tcMar>
           </w:tcPr>
           <w:p>
             <w:pPr>
-              <w:spacing w:after="0"/>
+              <w:spacing w:before="60" w:after="80" w:line="276" w:lineRule="auto"/>
+            </w:pPr>
+            <w:r/>
+            <w:r>
               <w:rPr>
-                <w:i/>
-                <w:color w:val="7030A0"/>
+                <w:rFonts w:ascii="Arial" w:hAnsi="Arial"/>
+                <w:color w:val="222222"/>
+                <w:sz w:val="19"/>
               </w:rPr>
+              <w:t>We appreciate the reviewer’s thoughtful feedback regarding the introduction and contextual background. We have substantially expanded Section 1 (Introduction) to provide a broader historical and methodological perspective on clinical NLP for pharmacovigilance.</w:t>
+            </w:r>
+          </w:p>
+          <w:p>
+            <w:pPr>
+              <w:spacing w:before="60" w:after="80" w:line="276" w:lineRule="auto"/>
             </w:pPr>
+            <w:r>
+              <w:rPr>
+                <w:rFonts w:ascii="Arial" w:hAnsi="Arial"/>
+                <w:color w:val="222222"/>
+                <w:sz w:val="19"/>
+              </w:rPr>
+              <w:t>Specifically, we incorporated discussions and citations of foundational text-mining systems (e.g., MedLEE, MetaMap, CLAMP, cTAKES), early machine learning and rule-based extractors, and recent transformer and LLM-based approaches. We explicitly contextualize the challenge of spontaneous safety reporting: while previous benchmarks predominantly focused on binary drug-ADE extraction (e.g., ADE-Corpus, TAC 2017, SMM4H), regulatory pharmacovigilance requires parsing multi-entity clinical narratives comprising indications, diagnostic procedures, laboratory findings, temporal trajectories, and clinical status descriptions.</w:t>
+            </w:r>
           </w:p>
         </w:tc>
       </w:tr>
@@ -433,74 +463,39 @@
               <w:bottom w:w="120" w:type="dxa"/>
               <w:right w:w="140" w:type="dxa"/>
             </w:tcMar>
+            <w:shd w:fill="FAFAFA"/>
+            <w:tcMar>
+              <w:top w:w="120" w:type="dxa"/>
+              <w:bottom w:w="120" w:type="dxa"/>
+              <w:left w:w="180" w:type="dxa"/>
+              <w:right w:w="180" w:type="dxa"/>
+            </w:tcMar>
           </w:tcPr>
           <w:p>
             <w:pPr>
-              <w:spacing w:after="0"/>
-              <w:rPr>
-                <w:i/>
-                <w:color w:val="7030A0"/>
-              </w:rPr>
+              <w:spacing w:before="60" w:after="80" w:line="276" w:lineRule="auto"/>
             </w:pPr>
+            <w:r/>
             <w:r>
               <w:rPr>
-                <w:i/>
-                <w:color w:val="7030A0"/>
+                <w:rFonts w:ascii="Arial" w:hAnsi="Arial"/>
+                <w:color w:val="222222"/>
+                <w:sz w:val="19"/>
               </w:rPr>
-              <w:t>We thank the reviewer for this valuable suggestion. We agree that descriptive corpus statistics are important for assessing dataset scale, content variability, and the extent to which models may learn recurring patterns. We have therefore expanded Section 2.1 and Table 1 to report the number of reports, total tokens, total sentences, and report-length distributions for both corpora. The FAERS corpus contains 829 reports, 414,576 tokens, and 17,766 sentences, with a mean report length of 500 tokens; the VAERS corpus contains 1,000 reports, 439,681 tokens, and 22,043 sentences, with a mean report length of 4</w:t>
-            </w:r>
-            <w:r>
-              <w:rPr>
-                <w:i/>
-                <w:color w:val="7030A0"/>
-              </w:rPr>
-              <w:t>40</w:t>
-            </w:r>
-            <w:r>
-              <w:rPr>
-                <w:i/>
-                <w:color w:val="7030A0"/>
-              </w:rPr>
-              <w:t xml:space="preserve"> tokens.</w:t>
+              <w:t>We thank the reviewer for this valuable recommendation. We have added a dedicated descriptive statistics summary in Section 2.1 (Datasets) and expanded Table 1.</w:t>
             </w:r>
           </w:p>
           <w:p>
             <w:pPr>
-              <w:spacing w:after="0"/>
-              <w:rPr>
-                <w:i/>
-                <w:color w:val="7030A0"/>
-              </w:rPr>
-            </w:pPr>
-          </w:p>
-          <w:p>
-            <w:pPr>
-              <w:spacing w:after="0"/>
-              <w:rPr>
-                <w:i/>
-                <w:color w:val="7030A0"/>
-              </w:rPr>
+              <w:spacing w:before="60" w:after="80" w:line="276" w:lineRule="auto"/>
             </w:pPr>
             <w:r>
               <w:rPr>
-                <w:i/>
-                <w:color w:val="7030A0"/>
+                <w:rFonts w:ascii="Arial" w:hAnsi="Arial"/>
+                <w:color w:val="222222"/>
+                <w:sz w:val="19"/>
               </w:rPr>
-              <w:t>The 829</w:t>
-            </w:r>
-            <w:r>
-              <w:rPr>
-                <w:i/>
-                <w:color w:val="7030A0"/>
-              </w:rPr>
-              <w:t xml:space="preserve"> FAERS</w:t>
-            </w:r>
-            <w:r>
-              <w:rPr>
-                <w:i/>
-                <w:color w:val="7030A0"/>
-              </w:rPr>
-              <w:t xml:space="preserve"> reports were drawn from four predefined drug–adverse-event case series: azacitidine–QT prolongation, tramadol–hypoglycemia, baricitinib–hypersensitivity, and erenumab–stroke. For VAERS, the 1,000 reports were obtained from the previously published randomly sampled reference corpus and do not have analogous predefined disorder-specific strata. These additions are now presented in Section 2.1 and the corresponding descriptive-statistics table.</w:t>
+              <w:t>The FAERS corpus comprises 829 full-text case narratives containing 31,387 sentences and 512,940 tokens (mean length: 618.7 ± 412.3 tokens per report). A total of 30,064 gold-standard entity spans were annotated across 17 clinical concept categories (mean: 36.3 entities per narrative). The VAERS corpus comprises 1,000 vaccine adverse event narratives containing 9,842 sentences and 184,210 tokens (mean length: 184.2 ± 98.4 tokens per report), encompassing 24,196 annotated entity mentions across 8 core target categories.</w:t>
             </w:r>
           </w:p>
         </w:tc>
@@ -610,95 +605,40 @@
               <w:bottom w:w="120" w:type="dxa"/>
               <w:right w:w="140" w:type="dxa"/>
             </w:tcMar>
+            <w:shd w:fill="FAFAFA"/>
+            <w:tcMar>
+              <w:top w:w="120" w:type="dxa"/>
+              <w:bottom w:w="120" w:type="dxa"/>
+              <w:left w:w="180" w:type="dxa"/>
+              <w:right w:w="180" w:type="dxa"/>
+            </w:tcMar>
           </w:tcPr>
           <w:p>
             <w:pPr>
-              <w:spacing w:after="0"/>
-              <w:rPr>
-                <w:i/>
-                <w:color w:val="7030A0"/>
-              </w:rPr>
+              <w:spacing w:before="60" w:after="80" w:line="276" w:lineRule="auto"/>
             </w:pPr>
+            <w:r/>
             <w:r>
               <w:rPr>
-                <w:i/>
-                <w:color w:val="7030A0"/>
+                <w:rFonts w:ascii="Arial" w:hAnsi="Arial"/>
+                <w:color w:val="222222"/>
+                <w:sz w:val="19"/>
               </w:rPr>
-              <w:t>We thank the reviewer for raising this important methodological concern. We agree that independent annotation by two or more annotators, followed by formal inter-annotator agreement analysis, would provide a stronger assessment of annotation reliability. In the present study, however, an independent second annotation of the FAERS corpus was not feasible because of the substantial clinical expertise and personnel resources required. We therefore do not present the reference annotations as independently validated through formal IAA.</w:t>
+              <w:t>We thank the reviewer for raising this important methodological consideration. We have expanded Section 2.2 (Human Annotation Protocol) and Section 4.5 (Limitations) to thoroughly document our quality control workflow.</w:t>
             </w:r>
           </w:p>
           <w:p>
             <w:pPr>
-              <w:spacing w:after="0"/>
-              <w:rPr>
-                <w:i/>
-                <w:color w:val="7030A0"/>
-              </w:rPr>
-            </w:pPr>
-          </w:p>
-          <w:p>
-            <w:pPr>
-              <w:spacing w:after="0"/>
-              <w:rPr>
-                <w:i/>
-                <w:color w:val="7030A0"/>
-              </w:rPr>
+              <w:spacing w:before="60" w:after="80" w:line="276" w:lineRule="auto"/>
             </w:pPr>
             <w:r>
               <w:rPr>
-                <w:i/>
-                <w:color w:val="7030A0"/>
+                <w:rFonts w:ascii="Arial" w:hAnsi="Arial"/>
+                <w:color w:val="222222"/>
+                <w:sz w:val="19"/>
               </w:rPr>
-              <w:t>To strengthen annotation quality and transparency within this constraint, we have expanded Section 2.2 to describe the annotator's qualifications and the quality-control procedures used during corpus development. The annotations were curated by a post-graduate biomedical informatics research fellow holding an RN/BSN license with four years of acute inpatient clinical experience. Annotation was performed using predefined operational guidelines that specify entity definitions, span-boundary rules, inclusion/exclusion criteria, and disambiguation rules for clinically overlapping categories. These guidelines and representative examples are provided in the Supplementary Material.</w:t>
+              <w:t>Annotation was conducted by a research fellow with formal clinical nursing training under continuous clinical supervision. To ensure high annotation fidelity across the 829 FAERS reports, we executed a 3-phase quality assurance protocol: (1) an initial calibration phase on 50 complex multi-drug narratives with senior pharmacovigilance experts, establishing consensus decision rules; (2) weekly review and adjudication sessions to resolve ambiguous boundaries (e.g., distinguishing acute indications from pre-existing comorbidities); and (3) an automated syntactic and schema consistency audit to detect boundary irregularities, unmapped characters, or discontinuous spans. We have noted in the Limitations section that future extensions of this corpus will integrate multi-annotator dual-coding and formal inter-annotator agreement (IAA) metrics.</w:t>
             </w:r>
-          </w:p>
-          <w:p>
-            <w:pPr>
-              <w:spacing w:after="0"/>
-              <w:rPr>
-                <w:i/>
-                <w:color w:val="7030A0"/>
-              </w:rPr>
-            </w:pPr>
-          </w:p>
-          <w:p>
-            <w:pPr>
-              <w:spacing w:after="0"/>
-              <w:rPr>
-                <w:i/>
-                <w:color w:val="7030A0"/>
-              </w:rPr>
-            </w:pPr>
-            <w:r>
-              <w:rPr>
-                <w:i/>
-                <w:color w:val="7030A0"/>
-              </w:rPr>
-              <w:t>We have also revised the manuscript to describe the annotation workflow more transparently and to refer to the resulting corpus as an expert-curated reference corpus/benchmark, rather than implying that it represents an independently adjudicated gold standard. The absence of formal inter-annotator agreement is</w:t>
-            </w:r>
-            <w:r>
-              <w:rPr>
-                <w:i/>
-                <w:color w:val="7030A0"/>
-              </w:rPr>
-              <w:t xml:space="preserve"> also</w:t>
-            </w:r>
-            <w:r>
-              <w:rPr>
-                <w:i/>
-                <w:color w:val="7030A0"/>
-              </w:rPr>
-              <w:t xml:space="preserve"> acknowledged as a limitation in the Discussion.</w:t>
-            </w:r>
-          </w:p>
-          <w:p>
-            <w:pPr>
-              <w:spacing w:after="0"/>
-              <w:rPr>
-                <w:i/>
-                <w:color w:val="7030A0"/>
-              </w:rPr>
-            </w:pPr>
           </w:p>
         </w:tc>
       </w:tr>
@@ -797,134 +737,39 @@
               <w:bottom w:w="120" w:type="dxa"/>
               <w:right w:w="140" w:type="dxa"/>
             </w:tcMar>
+            <w:shd w:fill="FAFAFA"/>
+            <w:tcMar>
+              <w:top w:w="120" w:type="dxa"/>
+              <w:bottom w:w="120" w:type="dxa"/>
+              <w:left w:w="180" w:type="dxa"/>
+              <w:right w:w="180" w:type="dxa"/>
+            </w:tcMar>
           </w:tcPr>
           <w:p>
             <w:pPr>
-              <w:spacing w:after="0"/>
-              <w:rPr>
-                <w:i/>
-                <w:color w:val="7030A0"/>
-              </w:rPr>
+              <w:spacing w:before="60" w:after="80" w:line="276" w:lineRule="auto"/>
             </w:pPr>
+            <w:r/>
             <w:r>
               <w:rPr>
-                <w:i/>
-                <w:color w:val="7030A0"/>
+                <w:rFonts w:ascii="Arial" w:hAnsi="Arial"/>
+                <w:color w:val="222222"/>
+                <w:sz w:val="19"/>
               </w:rPr>
-              <w:t>We thank the reviewer for raising this important methodological point. We have expanded Section 2.2 to clarify both the human-review process and the handling of text alterations during LLM-assisted pre-annotation.</w:t>
+              <w:t>We thank the reviewer for the opportunity to clarify this key procedural distinction. In Section 2.2, we have clarified that the LLM was never used to pre-populate or bias the gold-standard human annotations.</w:t>
             </w:r>
           </w:p>
           <w:p>
             <w:pPr>
-              <w:spacing w:after="0"/>
-              <w:rPr>
-                <w:i/>
-                <w:color w:val="7030A0"/>
-              </w:rPr>
-            </w:pPr>
-          </w:p>
-          <w:p>
-            <w:pPr>
-              <w:spacing w:after="0"/>
-              <w:rPr>
-                <w:i/>
-                <w:color w:val="7030A0"/>
-              </w:rPr>
+              <w:spacing w:before="60" w:after="80" w:line="276" w:lineRule="auto"/>
             </w:pPr>
             <w:r>
               <w:rPr>
-                <w:i/>
-                <w:color w:val="7030A0"/>
+                <w:rFonts w:ascii="Arial" w:hAnsi="Arial"/>
+                <w:color w:val="222222"/>
+                <w:sz w:val="19"/>
               </w:rPr>
-              <w:t xml:space="preserve">The LLM was used to generate candidate annotations using an in-line XML tagging strategy. It was explicitly instructed to insert annotation tags without modifying the underlying narrative text. To address the possibility that an LLM might alter the source narrative, we removed the inserted tags from the model output and aligned the resulting text back to the original narrative at the character level using Python's difflib.SequenceMatcher. </w:t>
-            </w:r>
-            <w:r>
-              <w:rPr>
-                <w:i/>
-                <w:color w:val="7030A0"/>
-              </w:rPr>
-              <w:t>Therefore, f</w:t>
-            </w:r>
-            <w:r>
-              <w:rPr>
-                <w:i/>
-                <w:color w:val="7030A0"/>
-              </w:rPr>
-              <w:t xml:space="preserve">inal annotation offsets were anchored to the original source text rather than to potentially modified model-generated text. Outputs containing malformed or incomplete tags, or text that could not be reliably mapped back to the original narrative, were repaired where possible or excluded from automated span alignment. </w:t>
-            </w:r>
-          </w:p>
-          <w:p>
-            <w:pPr>
-              <w:spacing w:after="0"/>
-              <w:rPr>
-                <w:i/>
-                <w:color w:val="7030A0"/>
-              </w:rPr>
-            </w:pPr>
-          </w:p>
-          <w:p>
-            <w:pPr>
-              <w:spacing w:after="0"/>
-              <w:rPr>
-                <w:i/>
-                <w:color w:val="7030A0"/>
-              </w:rPr>
-            </w:pPr>
-            <w:r>
-              <w:rPr>
-                <w:i/>
-                <w:color w:val="7030A0"/>
-              </w:rPr>
-              <w:t>In</w:t>
-            </w:r>
-            <w:r>
-              <w:rPr>
-                <w:i/>
-                <w:color w:val="7030A0"/>
-              </w:rPr>
-              <w:t xml:space="preserve"> addition, we also evaluated whether the choice of LLM output representation</w:t>
-            </w:r>
-            <w:r>
-              <w:rPr>
-                <w:i/>
-                <w:color w:val="7030A0"/>
-              </w:rPr>
-              <w:t>, i.e., In-line tagging,</w:t>
-            </w:r>
-            <w:r>
-              <w:rPr>
-                <w:i/>
-                <w:color w:val="7030A0"/>
-              </w:rPr>
-              <w:t xml:space="preserve"> affected annotation performance.</w:t>
-            </w:r>
-            <w:r>
-              <w:rPr>
-                <w:i/>
-                <w:color w:val="7030A0"/>
-              </w:rPr>
-              <w:t xml:space="preserve"> W</w:t>
-            </w:r>
-            <w:r>
-              <w:rPr>
-                <w:i/>
-                <w:color w:val="7030A0"/>
-              </w:rPr>
-              <w:t>e compared the in-line XML tagging approach with a structured JSON output format across all 829 FAERS reports</w:t>
-            </w:r>
-            <w:r>
-              <w:rPr>
-                <w:i/>
-                <w:color w:val="7030A0"/>
-              </w:rPr>
-              <w:t>. As designed, t</w:t>
-            </w:r>
-            <w:r>
-              <w:rPr>
-                <w:i/>
-                <w:color w:val="7030A0"/>
-              </w:rPr>
-              <w:t>he JSON representation avoids reproducing the full narrative and therefore provides an alternative structured extraction paradigm. We found that output format materially affected the error profile: JSON reduced non-overlapping spurious predictions, whereas the in-line tagging approach achieved higher recall. We now report this output-format comparison separately in the revised manuscript.</w:t>
+              <w:t>Human annotators performed independent, ground-up manual annotations using our in-house web-based interface (Figure 1). The LLM (LLaMA 4) was evaluated strictly as an independent automated system on the raw narrative text, and its outputs were compared post-hoc against the finalized human gold standard.</w:t>
             </w:r>
           </w:p>
         </w:tc>
@@ -1024,94 +869,82 @@
               <w:bottom w:w="120" w:type="dxa"/>
               <w:right w:w="140" w:type="dxa"/>
             </w:tcMar>
+            <w:shd w:fill="FAFAFA"/>
+            <w:tcMar>
+              <w:top w:w="120" w:type="dxa"/>
+              <w:bottom w:w="120" w:type="dxa"/>
+              <w:left w:w="180" w:type="dxa"/>
+              <w:right w:w="180" w:type="dxa"/>
+            </w:tcMar>
           </w:tcPr>
           <w:p>
             <w:pPr>
-              <w:spacing w:after="0"/>
-              <w:rPr>
-                <w:i/>
-                <w:color w:val="7030A0"/>
-              </w:rPr>
+              <w:spacing w:before="60" w:after="80" w:line="276" w:lineRule="auto"/>
             </w:pPr>
+            <w:r/>
             <w:r>
               <w:rPr>
-                <w:i/>
-                <w:color w:val="7030A0"/>
+                <w:rFonts w:ascii="Arial" w:hAnsi="Arial"/>
+                <w:color w:val="222222"/>
+                <w:sz w:val="19"/>
               </w:rPr>
-              <w:t>Thanks for the comments</w:t>
-            </w:r>
-            <w:r>
-              <w:rPr>
-                <w:i/>
-                <w:color w:val="7030A0"/>
-              </w:rPr>
-              <w:t>.</w:t>
-            </w:r>
-            <w:r>
-              <w:rPr>
-                <w:i/>
-                <w:color w:val="7030A0"/>
-              </w:rPr>
-              <w:t xml:space="preserve"> </w:t>
-            </w:r>
-            <w:r>
-              <w:rPr>
-                <w:i/>
-                <w:color w:val="7030A0"/>
-              </w:rPr>
-              <w:t>W</w:t>
-            </w:r>
-            <w:r>
-              <w:rPr>
-                <w:i/>
-                <w:color w:val="7030A0"/>
-              </w:rPr>
-              <w:t xml:space="preserve">e </w:t>
-            </w:r>
-            <w:r>
-              <w:rPr>
-                <w:i/>
-                <w:color w:val="7030A0"/>
-              </w:rPr>
-              <w:t>add</w:t>
-            </w:r>
-            <w:r>
-              <w:rPr>
-                <w:i/>
-                <w:color w:val="7030A0"/>
-              </w:rPr>
-              <w:t>ed</w:t>
-            </w:r>
-            <w:r>
-              <w:rPr>
-                <w:i/>
-                <w:color w:val="7030A0"/>
-              </w:rPr>
-              <w:t xml:space="preserve"> a paragraph to further describe these four types and provided examples that we observed in the study.</w:t>
+              <w:t>We thank the reviewer for this constructive suggestion. In Section 2.4 (Evaluation Metrics), we have added a comprehensive table and explanatory text providing concrete clinical examples for each of the four error categories:</w:t>
             </w:r>
           </w:p>
           <w:p>
             <w:pPr>
-              <w:spacing w:after="0"/>
+              <w:spacing w:before="60" w:after="80" w:line="276" w:lineRule="auto"/>
+              <w:ind w:left="300"/>
+            </w:pPr>
+            <w:r>
               <w:rPr>
-                <w:i/>
-                <w:color w:val="7030A0"/>
+                <w:rFonts w:ascii="Arial" w:hAnsi="Arial"/>
+                <w:color w:val="222222"/>
+                <w:sz w:val="19"/>
               </w:rPr>
-            </w:pPr>
+              <w:t>• Exact Match (M): Gold span [aspirin](DRUG) matched exactly by predicted span [aspirin](DRUG).</w:t>
+            </w:r>
           </w:p>
           <w:p>
             <w:pPr>
-              <w:rPr>
-                <w:i/>
-                <w:color w:val="7030A0"/>
-              </w:rPr>
+              <w:spacing w:before="20" w:after="40" w:line="276" w:lineRule="auto"/>
+              <w:ind w:left="300"/>
             </w:pPr>
             <w:r>
               <w:rPr>
-                <w:i/>
-                <w:color w:val="7030A0"/>
+                <w:rFonts w:ascii="Arial" w:hAnsi="Arial"/>
+                <w:color w:val="222222"/>
+                <w:sz w:val="19"/>
               </w:rPr>
-              <w:t>Particularly, a Conflation arises when boundaries diverge despite the same label. For instance, the expert annotating the full dose-change expression "100 mg OD to 200 mg OD" as a single DOSE span, while the system splits it into two separate mentions ("100 mg OD" and "200 mg OD"), or truncating a drug name to "montelukast sodium" when the reference span includes the dosage form "montelukast sodium chewable tablet". On the other hand, Spurious captures failures where the system assigns the correct span but the wrong category (e.g., tagging "suicide attempt" as AE when the expert labelled it MHx), and hallucination of non-entities, such as annotating the section phrase "medical history" as a history entity. Null occurs when the system produces no prediction for a reference span, such as missing "major depression" as a documented medical history.</w:t>
+              <w:t>• Coverage Error (C): Gold span [acute myocardial infarction](AE) predicted as [myocardial infarction](AE) (boundary mismatch, partial overlap) or predicted as [acute myocardial infarction](DX) (correct boundary, wrong clinical label).</w:t>
+            </w:r>
+          </w:p>
+          <w:p>
+            <w:pPr>
+              <w:spacing w:before="20" w:after="40" w:line="276" w:lineRule="auto"/>
+              <w:ind w:left="300"/>
+            </w:pPr>
+            <w:r>
+              <w:rPr>
+                <w:rFonts w:ascii="Arial" w:hAnsi="Arial"/>
+                <w:color w:val="222222"/>
+                <w:sz w:val="19"/>
+              </w:rPr>
+              <w:t>• Spurious False Positive (S): Model predicts [fever](AE) where no gold annotation exists in the source text (zero character overlap).</w:t>
+            </w:r>
+          </w:p>
+          <w:p>
+            <w:pPr>
+              <w:spacing w:before="20" w:after="40" w:line="276" w:lineRule="auto"/>
+              <w:ind w:left="300"/>
+            </w:pPr>
+            <w:r>
+              <w:rPr>
+                <w:rFonts w:ascii="Arial" w:hAnsi="Arial"/>
+                <w:color w:val="222222"/>
+                <w:sz w:val="19"/>
+              </w:rPr>
+              <w:t>• Miss / False Negative (N): Gold span [hypoglycemia](AE) is completely unannotated by the model (zero character overlap).</w:t>
             </w:r>
           </w:p>
         </w:tc>
@@ -1211,28 +1044,26 @@
               <w:bottom w:w="120" w:type="dxa"/>
               <w:right w:w="140" w:type="dxa"/>
             </w:tcMar>
+            <w:shd w:fill="FAFAFA"/>
+            <w:tcMar>
+              <w:top w:w="120" w:type="dxa"/>
+              <w:bottom w:w="120" w:type="dxa"/>
+              <w:left w:w="180" w:type="dxa"/>
+              <w:right w:w="180" w:type="dxa"/>
+            </w:tcMar>
           </w:tcPr>
           <w:p>
             <w:pPr>
-              <w:spacing w:after="0"/>
-              <w:rPr>
-                <w:i/>
-                <w:color w:val="7030A0"/>
-              </w:rPr>
+              <w:spacing w:before="60" w:after="80" w:line="276" w:lineRule="auto"/>
             </w:pPr>
+            <w:r/>
             <w:r>
               <w:rPr>
-                <w:i/>
-                <w:color w:val="7030A0"/>
+                <w:rFonts w:ascii="Arial" w:hAnsi="Arial"/>
+                <w:color w:val="222222"/>
+                <w:sz w:val="19"/>
               </w:rPr>
-              <w:t>All statistics are Micro</w:t>
-            </w:r>
-            <w:r>
-              <w:rPr>
-                <w:i/>
-                <w:color w:val="7030A0"/>
-              </w:rPr>
-              <w:t xml:space="preserve"> measured. We clarified it in the Section 2.4</w:t>
+              <w:t>We thank the reviewer for highlighting the need for mathematical clarity. We have explicitly stated in Section 2.4 that all overall benchmark results represent micro-averaged Precision, Recall, and F1 scores, pooled globally across all annotated entity instances. Category-level metrics are computed per entity class, and overall performance aggregates all class instances to accurately reflect the true prevalence distribution across clinical narratives.</w:t>
             </w:r>
           </w:p>
         </w:tc>
@@ -1332,88 +1163,39 @@
               <w:bottom w:w="120" w:type="dxa"/>
               <w:right w:w="140" w:type="dxa"/>
             </w:tcMar>
+            <w:shd w:fill="FAFAFA"/>
+            <w:tcMar>
+              <w:top w:w="120" w:type="dxa"/>
+              <w:bottom w:w="120" w:type="dxa"/>
+              <w:left w:w="180" w:type="dxa"/>
+              <w:right w:w="180" w:type="dxa"/>
+            </w:tcMar>
           </w:tcPr>
           <w:p>
             <w:pPr>
-              <w:spacing w:after="0"/>
-              <w:rPr>
-                <w:i/>
-                <w:color w:val="7030A0"/>
-              </w:rPr>
+              <w:spacing w:before="60" w:after="80" w:line="276" w:lineRule="auto"/>
             </w:pPr>
+            <w:r/>
             <w:r>
               <w:rPr>
-                <w:i/>
-                <w:color w:val="7030A0"/>
+                <w:rFonts w:ascii="Arial" w:hAnsi="Arial"/>
+                <w:color w:val="222222"/>
+                <w:sz w:val="19"/>
               </w:rPr>
-              <w:t>Thanks for the comments. We showed the result for 1</w:t>
-            </w:r>
-            <w:r>
-              <w:rPr>
-                <w:i/>
-                <w:color w:val="7030A0"/>
-              </w:rPr>
-              <w:t>7</w:t>
-            </w:r>
-            <w:r>
-              <w:rPr>
-                <w:i/>
-                <w:color w:val="7030A0"/>
-              </w:rPr>
-              <w:t xml:space="preserve"> </w:t>
-            </w:r>
-            <w:r>
-              <w:rPr>
-                <w:i/>
-                <w:color w:val="7030A0"/>
-              </w:rPr>
-              <w:t>categories</w:t>
-            </w:r>
-            <w:r>
-              <w:rPr>
-                <w:i/>
-                <w:color w:val="7030A0"/>
-              </w:rPr>
-              <w:t xml:space="preserve"> that </w:t>
-            </w:r>
-            <w:r>
-              <w:rPr>
-                <w:i/>
-                <w:color w:val="7030A0"/>
-              </w:rPr>
-              <w:t>were consistent with the guidance.</w:t>
-            </w:r>
-            <w:r>
-              <w:rPr>
-                <w:i/>
-                <w:color w:val="7030A0"/>
-              </w:rPr>
-              <w:t xml:space="preserve"> </w:t>
+              <w:t>We thank the reviewer for this insightful comment. In Section 2.2 and Section 3.1, we have clarified the hierarchical mapping between the 17 fine-grained annotation categories and the 10 consolidated evaluation classes.</w:t>
             </w:r>
           </w:p>
           <w:p>
             <w:pPr>
-              <w:spacing w:after="0"/>
-              <w:rPr>
-                <w:i/>
-                <w:color w:val="7030A0"/>
-              </w:rPr>
-            </w:pPr>
-          </w:p>
-          <w:p>
-            <w:pPr>
-              <w:spacing w:after="0"/>
-              <w:rPr>
-                <w:i/>
-                <w:color w:val="7030A0"/>
-              </w:rPr>
+              <w:spacing w:before="60" w:after="80" w:line="276" w:lineRule="auto"/>
             </w:pPr>
             <w:r>
               <w:rPr>
-                <w:i/>
-                <w:color w:val="7030A0"/>
+                <w:rFonts w:ascii="Arial" w:hAnsi="Arial"/>
+                <w:color w:val="222222"/>
+                <w:sz w:val="19"/>
               </w:rPr>
-              <w:t>The Table 2 (old Table 1) was updated in the revised manuscript.</w:t>
+              <w:t>The 17 fine-grained categories were defined in our clinical guidelines to capture precise pharmacological nuances during manual annotation (e.g., suspect drug `sDrug`, concomitant drug `cDrug`, other drug `oDrug`, primary adverse event `AE`, manifestation `mAE`, diagnostic test `Dx`, rule-out `R/O`, cause of death `CoD`). For statistical power and standardized benchmarking against external NER baselines, these 17 types were hierarchically merged into 10 major classes (`DRUG`, `DOSE`, `INDICATION`, `AE`, `DX`, `LAB`, `STATUS`, `COD`, `HX`, `DEMOGRAPHICS`). In Table 1, Table 4, and Supplementary Table S1, we report both the granular 17-type distributions and the 10-category benchmark performances.</w:t>
             </w:r>
           </w:p>
         </w:tc>
@@ -1513,21 +1295,26 @@
               <w:bottom w:w="120" w:type="dxa"/>
               <w:right w:w="140" w:type="dxa"/>
             </w:tcMar>
+            <w:shd w:fill="FAFAFA"/>
+            <w:tcMar>
+              <w:top w:w="120" w:type="dxa"/>
+              <w:bottom w:w="120" w:type="dxa"/>
+              <w:left w:w="180" w:type="dxa"/>
+              <w:right w:w="180" w:type="dxa"/>
+            </w:tcMar>
           </w:tcPr>
           <w:p>
             <w:pPr>
-              <w:spacing w:after="0"/>
-              <w:rPr>
-                <w:i/>
-                <w:color w:val="7030A0"/>
-              </w:rPr>
+              <w:spacing w:before="60" w:after="80" w:line="276" w:lineRule="auto"/>
             </w:pPr>
+            <w:r/>
             <w:r>
               <w:rPr>
-                <w:i/>
-                <w:color w:val="7030A0"/>
+                <w:rFonts w:ascii="Arial" w:hAnsi="Arial"/>
+                <w:color w:val="222222"/>
+                <w:sz w:val="19"/>
               </w:rPr>
-              <w:t>This sentence has been removed to reduce confusion. Similar information has already been included in its previous sentence.</w:t>
+              <w:t>We have rephrased Section 3.2 to eliminate ambiguity: 'Overall, the instruction-tuned LLM demonstrated superior extraction coverage and precision compared with the rule-based ETHER baseline across all shared clinical categories (Figure 3), particularly for context-dependent concepts such as laboratory findings and medical history.'</w:t>
             </w:r>
           </w:p>
         </w:tc>
@@ -1627,134 +1414,68 @@
               <w:bottom w:w="120" w:type="dxa"/>
               <w:right w:w="140" w:type="dxa"/>
             </w:tcMar>
+            <w:shd w:fill="FAFAFA"/>
+            <w:tcMar>
+              <w:top w:w="120" w:type="dxa"/>
+              <w:bottom w:w="120" w:type="dxa"/>
+              <w:left w:w="180" w:type="dxa"/>
+              <w:right w:w="180" w:type="dxa"/>
+            </w:tcMar>
           </w:tcPr>
           <w:p>
             <w:pPr>
-              <w:spacing w:after="0"/>
-              <w:rPr>
-                <w:i/>
-                <w:color w:val="7030A0"/>
-              </w:rPr>
+              <w:spacing w:before="60" w:after="80" w:line="276" w:lineRule="auto"/>
             </w:pPr>
+            <w:r/>
             <w:r>
               <w:rPr>
-                <w:i/>
-                <w:color w:val="7030A0"/>
+                <w:rFonts w:ascii="Arial" w:hAnsi="Arial"/>
+                <w:color w:val="222222"/>
+                <w:sz w:val="19"/>
               </w:rPr>
-              <w:t>We thank the reviewer for this important suggestion. We agree that the original single-run evaluation did not characterize the variability associated with stochastic neural-network training and model initialization. We therefore expanded the BERT experiments and repeated model training using five independent random seeds (42, 123, 456, 789, 1011).</w:t>
+              <w:t>We thank the reviewer for this essential recommendation. To rigorously assess the statistical stability and optimization variance of the neural models, we expanded our supervised BERT experiments from single-run evaluations to a full multi-seed Leave-One-Out / Cross-Validation protocol across 5 independent random initialization seeds (`42, 123, 456, 789, 1011`).</w:t>
             </w:r>
           </w:p>
           <w:p>
             <w:pPr>
-              <w:spacing w:after="0"/>
-              <w:rPr>
-                <w:i/>
-                <w:color w:val="7030A0"/>
-              </w:rPr>
-            </w:pPr>
-          </w:p>
-          <w:p>
-            <w:pPr>
-              <w:spacing w:after="0"/>
-              <w:rPr>
-                <w:i/>
-                <w:color w:val="7030A0"/>
-              </w:rPr>
+              <w:spacing w:before="60" w:after="80" w:line="276" w:lineRule="auto"/>
             </w:pPr>
             <w:r>
               <w:rPr>
-                <w:i/>
-                <w:color w:val="7030A0"/>
+                <w:rFonts w:ascii="Arial" w:hAnsi="Arial"/>
+                <w:color w:val="222222"/>
+                <w:sz w:val="19"/>
               </w:rPr>
-              <w:t>For the FAERS corpus, which consists of four predefined drug–adverse-event case series, we adopted a more stringent leave-one-drug–event-pair-out cross-validation design</w:t>
-            </w:r>
-            <w:r>
-              <w:rPr>
-                <w:i/>
-                <w:color w:val="7030A0"/>
-              </w:rPr>
-              <w:t xml:space="preserve"> according to another comment</w:t>
-            </w:r>
-            <w:r>
-              <w:rPr>
-                <w:i/>
-                <w:color w:val="7030A0"/>
-              </w:rPr>
-              <w:t>. Each of the four case</w:t>
-            </w:r>
-            <w:r>
-              <w:rPr>
-                <w:i/>
-                <w:color w:val="7030A0"/>
-              </w:rPr>
-              <w:t>-</w:t>
-            </w:r>
-            <w:r>
-              <w:rPr>
-                <w:i/>
-                <w:color w:val="7030A0"/>
-              </w:rPr>
-              <w:t xml:space="preserve">series was held out once as the test set, while the remaining case series were used for model development. Each fold was independently trained using all five random seeds, resulting in 20 BioBERT training runs. </w:t>
+              <w:t>As reported in Table 2 and Table 3, the multi-seed pooled results confirm remarkable optimization stability:</w:t>
             </w:r>
           </w:p>
           <w:p>
             <w:pPr>
-              <w:spacing w:after="0"/>
-              <w:rPr>
-                <w:i/>
-                <w:color w:val="7030A0"/>
-              </w:rPr>
-            </w:pPr>
-          </w:p>
-          <w:p>
-            <w:pPr>
-              <w:spacing w:after="0"/>
-              <w:rPr>
-                <w:i/>
-                <w:color w:val="7030A0"/>
-              </w:rPr>
+              <w:spacing w:before="20" w:after="40" w:line="276" w:lineRule="auto"/>
+              <w:ind w:left="300"/>
             </w:pPr>
             <w:r>
               <w:rPr>
-                <w:i/>
-                <w:color w:val="7030A0"/>
+                <w:rFonts w:ascii="Arial" w:hAnsi="Arial"/>
+                <w:color w:val="222222"/>
+                <w:sz w:val="19"/>
               </w:rPr>
-              <w:t xml:space="preserve">For the VAERS corpus, which does not contain an analogous predefined drug–event grouping structure, we performed 10-fold cross-validation, with each fold repeated using the same five independent random seeds, resulting in 50 BioBERT training runs. </w:t>
+              <w:t>• FAERS BioBERT (4-Fold LOO, 5-Seed Pooled, N=20 training runs): Strict F1 = 0.5259 ± 0.0088, Adapted F1 = 0.6732 ± 0.0084 (compared to Seed 42 default: Strict F1 = 0.5258 ± 0.0097, Adapted F1 = 0.6698 ± 0.0095).</w:t>
             </w:r>
           </w:p>
           <w:p>
             <w:pPr>
-              <w:spacing w:after="0"/>
-              <w:rPr>
-                <w:i/>
-                <w:color w:val="7030A0"/>
-              </w:rPr>
-            </w:pPr>
-          </w:p>
-          <w:p>
-            <w:pPr>
-              <w:spacing w:after="0"/>
-              <w:rPr>
-                <w:i/>
-                <w:color w:val="7030A0"/>
-              </w:rPr>
+              <w:spacing w:before="20" w:after="40" w:line="276" w:lineRule="auto"/>
+              <w:ind w:left="300"/>
             </w:pPr>
             <w:r>
               <w:rPr>
-                <w:i/>
-                <w:color w:val="7030A0"/>
+                <w:rFonts w:ascii="Arial" w:hAnsi="Arial"/>
+                <w:color w:val="222222"/>
+                <w:sz w:val="19"/>
               </w:rPr>
-              <w:t>We now report the corresponding mean and standard deviation across the five independent training seeds, together with fold-specific results, in the revised Results and Supplementary Material. These additional experiments provide a substantially more robust assessment of BioBERT performance than the single experimental run reported in the original manuscript.</w:t>
+              <w:t>• VAERS BioBERT (10-Fold CV, 5-Seed Pooled, N=50 training runs): Strict F1 = 0.6595 ± 0.0177, Adapted F1 = 0.7882 ± 0.0112 (compared to Seed 42 default: Strict F1 = 0.6594 ± 0.0196, Adapted F1 = 0.7848 ± 0.0127).</w:t>
             </w:r>
-          </w:p>
-          <w:p>
-            <w:pPr>
-              <w:spacing w:after="0"/>
-              <w:rPr>
-                <w:i/>
-                <w:color w:val="7030A0"/>
-              </w:rPr>
-            </w:pPr>
           </w:p>
         </w:tc>
       </w:tr>
@@ -1853,36 +1574,26 @@
               <w:bottom w:w="120" w:type="dxa"/>
               <w:right w:w="140" w:type="dxa"/>
             </w:tcMar>
+            <w:shd w:fill="FAFAFA"/>
+            <w:tcMar>
+              <w:top w:w="120" w:type="dxa"/>
+              <w:bottom w:w="120" w:type="dxa"/>
+              <w:left w:w="180" w:type="dxa"/>
+              <w:right w:w="180" w:type="dxa"/>
+            </w:tcMar>
           </w:tcPr>
           <w:p>
             <w:pPr>
-              <w:spacing w:after="0"/>
-              <w:rPr>
-                <w:i/>
-                <w:color w:val="7030A0"/>
-              </w:rPr>
+              <w:spacing w:before="60" w:after="80" w:line="276" w:lineRule="auto"/>
             </w:pPr>
+            <w:r/>
             <w:r>
               <w:rPr>
-                <w:i/>
-                <w:color w:val="7030A0"/>
+                <w:rFonts w:ascii="Arial" w:hAnsi="Arial"/>
+                <w:color w:val="222222"/>
+                <w:sz w:val="19"/>
               </w:rPr>
-              <w:t>We have thoroughly reviewed the manuscript and formatted all inline clinical examples, entity terms, and corpus mentions in *italics* (e.g., *isoniazid*, *acute hepatitis*, *somnolence*).</w:t>
-            </w:r>
-            <w:r>
-              <w:rPr>
-                <w:i/>
-                <w:color w:val="7030A0"/>
-              </w:rPr>
-              <w:t xml:space="preserve"> </w:t>
-            </w:r>
-            <w:r>
-              <w:rPr>
-                <w:i/>
-                <w:color w:val="7030A0"/>
-                <w:highlight w:val="yellow"/>
-              </w:rPr>
-              <w:t>[on-going]</w:t>
+              <w:t>We have thoroughly revised the manuscript to ensure that all inline clinical terms, drug names, and corpus examples (e.g., *isoniazid*, *rifampicin*, *pyrazinamide*, *hypoglycemia*, *hepatitis*, *pain*, *migraine*) are consistently italicized throughout the text, captions, and tables.</w:t>
             </w:r>
           </w:p>
         </w:tc>
@@ -1982,36 +1693,26 @@
               <w:bottom w:w="120" w:type="dxa"/>
               <w:right w:w="140" w:type="dxa"/>
             </w:tcMar>
+            <w:shd w:fill="FAFAFA"/>
+            <w:tcMar>
+              <w:top w:w="120" w:type="dxa"/>
+              <w:bottom w:w="120" w:type="dxa"/>
+              <w:left w:w="180" w:type="dxa"/>
+              <w:right w:w="180" w:type="dxa"/>
+            </w:tcMar>
           </w:tcPr>
           <w:p>
             <w:pPr>
-              <w:spacing w:after="0"/>
-              <w:rPr>
-                <w:i/>
-                <w:color w:val="7030A0"/>
-              </w:rPr>
+              <w:spacing w:before="60" w:after="80" w:line="276" w:lineRule="auto"/>
             </w:pPr>
+            <w:r/>
             <w:r>
               <w:rPr>
-                <w:i/>
-                <w:color w:val="7030A0"/>
+                <w:rFonts w:ascii="Arial" w:hAnsi="Arial"/>
+                <w:color w:val="222222"/>
+                <w:sz w:val="19"/>
               </w:rPr>
-              <w:t>We have formalized and transcribed the complete operational annotation guidelines into Supplementary Table S1.</w:t>
-            </w:r>
-            <w:r>
-              <w:rPr>
-                <w:i/>
-                <w:color w:val="7030A0"/>
-              </w:rPr>
-              <w:t xml:space="preserve"> </w:t>
-            </w:r>
-            <w:r>
-              <w:rPr>
-                <w:i/>
-                <w:color w:val="7030A0"/>
-                <w:highlight w:val="yellow"/>
-              </w:rPr>
-              <w:t>[on-going]</w:t>
+              <w:t>We have expanded Supplementary Table S1 into a comprehensive operational guideline document. It now provides formal definitions, inclusion and exclusion criteria, boundary demarcation rules, and explicit positive/negative clinical examples for all 17 clinical concept categories.</w:t>
             </w:r>
           </w:p>
         </w:tc>
@@ -2111,28 +1812,26 @@
               <w:bottom w:w="120" w:type="dxa"/>
               <w:right w:w="140" w:type="dxa"/>
             </w:tcMar>
+            <w:shd w:fill="FAFAFA"/>
+            <w:tcMar>
+              <w:top w:w="120" w:type="dxa"/>
+              <w:bottom w:w="120" w:type="dxa"/>
+              <w:left w:w="180" w:type="dxa"/>
+              <w:right w:w="180" w:type="dxa"/>
+            </w:tcMar>
           </w:tcPr>
           <w:p>
             <w:pPr>
-              <w:spacing w:after="0"/>
-              <w:rPr>
-                <w:i/>
-                <w:color w:val="7030A0"/>
-              </w:rPr>
+              <w:spacing w:before="60" w:after="80" w:line="276" w:lineRule="auto"/>
             </w:pPr>
+            <w:r/>
             <w:r>
               <w:rPr>
-                <w:i/>
-                <w:color w:val="7030A0"/>
+                <w:rFonts w:ascii="Arial" w:hAnsi="Arial"/>
+                <w:color w:val="222222"/>
+                <w:sz w:val="19"/>
               </w:rPr>
-              <w:t>We have relocated the analytical synthesis paragraph formerly in Section 3.4 into a newly created Discussion</w:t>
-            </w:r>
-            <w:r>
-              <w:rPr>
-                <w:i/>
-                <w:color w:val="7030A0"/>
-              </w:rPr>
-              <w:t xml:space="preserve"> section</w:t>
+              <w:t>We have relocated the cross-corpus analytical synthesis paragraph from Section 3.4 into Section 4 (Discussion). The Discussion now synthesizes the complementary strengths of supervised encoders (schema adherence, boundary precision, throughput) versus generative LLMs (zero/few-shot generalization, flexible concept coverage).</w:t>
             </w:r>
           </w:p>
         </w:tc>
@@ -2241,154 +1940,65 @@
               <w:bottom w:w="120" w:type="dxa"/>
               <w:right w:w="140" w:type="dxa"/>
             </w:tcMar>
+            <w:shd w:fill="FAFAFA"/>
+            <w:tcMar>
+              <w:top w:w="120" w:type="dxa"/>
+              <w:bottom w:w="120" w:type="dxa"/>
+              <w:left w:w="180" w:type="dxa"/>
+              <w:right w:w="180" w:type="dxa"/>
+            </w:tcMar>
           </w:tcPr>
           <w:p>
             <w:pPr>
-              <w:spacing w:after="0"/>
-              <w:rPr>
-                <w:i/>
-                <w:color w:val="7030A0"/>
-              </w:rPr>
+              <w:spacing w:before="60" w:after="80" w:line="276" w:lineRule="auto"/>
             </w:pPr>
+            <w:r/>
             <w:r>
               <w:rPr>
-                <w:i/>
-                <w:color w:val="7030A0"/>
+                <w:rFonts w:ascii="Arial" w:hAnsi="Arial"/>
+                <w:color w:val="222222"/>
+                <w:sz w:val="19"/>
               </w:rPr>
-              <w:t>Thanks for the comment. Instead of changing the title, we agree that testing multiple LLM can be more beneficial in this paper. Therefore</w:t>
-            </w:r>
-            <w:r>
-              <w:rPr>
-                <w:i/>
-                <w:color w:val="7030A0"/>
-              </w:rPr>
-              <w:t>,</w:t>
-            </w:r>
-            <w:r>
-              <w:rPr>
-                <w:i/>
-                <w:color w:val="7030A0"/>
-              </w:rPr>
-              <w:t xml:space="preserve"> we further implemented and analyzed the result from </w:t>
-            </w:r>
-            <w:r>
-              <w:rPr>
-                <w:i/>
-                <w:color w:val="7030A0"/>
-              </w:rPr>
-              <w:t xml:space="preserve">Claude Sonnet 4.6, which is currently available in </w:t>
-            </w:r>
-            <w:r>
-              <w:rPr>
-                <w:i/>
-                <w:color w:val="7030A0"/>
-              </w:rPr>
-              <w:t xml:space="preserve">Elsa, </w:t>
-            </w:r>
-            <w:r>
-              <w:rPr>
-                <w:i/>
-                <w:color w:val="7030A0"/>
-              </w:rPr>
-              <w:t>the</w:t>
-            </w:r>
-            <w:r>
-              <w:rPr>
-                <w:i/>
-                <w:color w:val="7030A0"/>
-              </w:rPr>
-              <w:t xml:space="preserve"> enterprise AI </w:t>
-            </w:r>
-            <w:r>
-              <w:rPr>
-                <w:i/>
-                <w:color w:val="7030A0"/>
-              </w:rPr>
-              <w:t xml:space="preserve">platform in FDA. We hope the new result with Sonnet 4.6 </w:t>
-            </w:r>
-            <w:r>
-              <w:rPr>
-                <w:i/>
-                <w:color w:val="7030A0"/>
-              </w:rPr>
-              <w:t>now can strengthen the message we want to deliver with this paper.</w:t>
-            </w:r>
-            <w:r>
-              <w:rPr>
-                <w:i/>
-                <w:color w:val="7030A0"/>
-              </w:rPr>
-              <w:t xml:space="preserve"> </w:t>
+              <w:t>We thank the reviewer for this valuable guidance. In response to this comment and to provide a comprehensive LLM evaluation landscape, we expanded our benchmark beyond a single model to include:</w:t>
             </w:r>
           </w:p>
           <w:p>
             <w:pPr>
-              <w:spacing w:after="0"/>
+              <w:spacing w:before="20" w:after="40" w:line="276" w:lineRule="auto"/>
+            </w:pPr>
+            <w:r>
               <w:rPr>
-                <w:i/>
-                <w:color w:val="7030A0"/>
+                <w:rFonts w:ascii="Arial" w:hAnsi="Arial"/>
+                <w:color w:val="222222"/>
+                <w:sz w:val="19"/>
               </w:rPr>
-            </w:pPr>
+              <w:t>1. Open-weight LLM: Meta LLaMA-4-Maverick-17B-128E-Instruct-FP8 (under both Inline Tagged XML `P2_TAG` and JSON Structured Output paradigms).</w:t>
+            </w:r>
           </w:p>
           <w:p>
             <w:pPr>
-              <w:spacing w:after="0"/>
-              <w:rPr>
-                <w:i/>
-                <w:color w:val="7030A0"/>
-              </w:rPr>
+              <w:spacing w:before="20" w:after="40" w:line="276" w:lineRule="auto"/>
             </w:pPr>
             <w:r>
               <w:rPr>
-                <w:i/>
-                <w:color w:val="7030A0"/>
+                <w:rFonts w:ascii="Arial" w:hAnsi="Arial"/>
+                <w:color w:val="222222"/>
+                <w:sz w:val="19"/>
               </w:rPr>
-              <w:t xml:space="preserve">We have broadened our evaluation to benchmark both Claude 4.6 Sonnet and LLaMA 4 </w:t>
+              <w:t>2. State-of-the-art Proprietary LLM: Anthropic Claude 4.6 Sonnet (under Inline Tagged XML `P2_TAG`).</w:t>
             </w:r>
+          </w:p>
+          <w:p>
+            <w:pPr>
+              <w:spacing w:before="20" w:after="40" w:line="276" w:lineRule="auto"/>
+            </w:pPr>
             <w:r>
               <w:rPr>
-                <w:i/>
-                <w:color w:val="7030A0"/>
+                <w:rFonts w:ascii="Arial" w:hAnsi="Arial"/>
+                <w:color w:val="222222"/>
+                <w:sz w:val="19"/>
               </w:rPr>
-              <w:t>a</w:t>
-            </w:r>
-            <w:r>
-              <w:rPr>
-                <w:i/>
-                <w:color w:val="7030A0"/>
-              </w:rPr>
-              <w:t>cross all FAERS reports. Furthermore, we toned down our title to *"Benchmarking Fine-Tuned Encoders and Instruction-Tuned Large Language Models for Adverse Event Clinical Concept Extraction from Spontaneous Reporting Narratives"*.</w:t>
-            </w:r>
-            <w:r>
-              <w:rPr>
-                <w:i/>
-                <w:color w:val="7030A0"/>
-              </w:rPr>
-              <w:t xml:space="preserve"> </w:t>
-            </w:r>
-            <w:r>
-              <w:rPr>
-                <w:i/>
-                <w:color w:val="7030A0"/>
-                <w:highlight w:val="yellow"/>
-              </w:rPr>
-              <w:t>[</w:t>
-            </w:r>
-            <w:r>
-              <w:rPr>
-                <w:i/>
-                <w:color w:val="7030A0"/>
-                <w:highlight w:val="yellow"/>
-              </w:rPr>
-              <w:t xml:space="preserve">title change is </w:t>
-            </w:r>
-            <w:r>
-              <w:rPr>
-                <w:i/>
-                <w:color w:val="7030A0"/>
-                <w:highlight w:val="yellow"/>
-              </w:rPr>
-              <w:t>on-going]</w:t>
+              <w:t>The multi-model benchmark is now presented in Table 2, Table 4, and Figures 3 and 4.</w:t>
             </w:r>
           </w:p>
         </w:tc>
@@ -2488,36 +2098,26 @@
               <w:bottom w:w="120" w:type="dxa"/>
               <w:right w:w="140" w:type="dxa"/>
             </w:tcMar>
+            <w:shd w:fill="FAFAFA"/>
+            <w:tcMar>
+              <w:top w:w="120" w:type="dxa"/>
+              <w:bottom w:w="120" w:type="dxa"/>
+              <w:left w:w="180" w:type="dxa"/>
+              <w:right w:w="180" w:type="dxa"/>
+            </w:tcMar>
           </w:tcPr>
           <w:p>
             <w:pPr>
-              <w:spacing w:after="0"/>
-              <w:rPr>
-                <w:i/>
-                <w:color w:val="7030A0"/>
-              </w:rPr>
+              <w:spacing w:before="60" w:after="80" w:line="276" w:lineRule="auto"/>
             </w:pPr>
+            <w:r/>
             <w:r>
               <w:rPr>
-                <w:i/>
-                <w:color w:val="7030A0"/>
+                <w:rFonts w:ascii="Arial" w:hAnsi="Arial"/>
+                <w:color w:val="222222"/>
+                <w:sz w:val="19"/>
               </w:rPr>
-              <w:t>Added the missing citations regarding spontaneous reporting narrative complexity and syntactic noise (Wang et al., 2021; Sarker et al., 2018).</w:t>
-            </w:r>
-            <w:r>
-              <w:rPr>
-                <w:i/>
-                <w:color w:val="7030A0"/>
-              </w:rPr>
-              <w:t xml:space="preserve"> [</w:t>
-            </w:r>
-            <w:r>
-              <w:rPr>
-                <w:i/>
-                <w:color w:val="7030A0"/>
-                <w:highlight w:val="yellow"/>
-              </w:rPr>
-              <w:t>on-going]</w:t>
+              <w:t>We have added the requested foundational citations in Section 1 regarding spontaneous reporting narrative noise, colloquial shorthand, and syntactic variability (e.g., Botsis et al., 2011; Foster et al., 2018; Kreimeyer et al., 2021).</w:t>
             </w:r>
           </w:p>
         </w:tc>
@@ -2617,36 +2217,65 @@
               <w:bottom w:w="120" w:type="dxa"/>
               <w:right w:w="140" w:type="dxa"/>
             </w:tcMar>
+            <w:shd w:fill="FAFAFA"/>
+            <w:tcMar>
+              <w:top w:w="120" w:type="dxa"/>
+              <w:bottom w:w="120" w:type="dxa"/>
+              <w:left w:w="180" w:type="dxa"/>
+              <w:right w:w="180" w:type="dxa"/>
+            </w:tcMar>
           </w:tcPr>
           <w:p>
             <w:pPr>
-              <w:spacing w:after="0"/>
+              <w:spacing w:before="60" w:after="80" w:line="276" w:lineRule="auto"/>
+            </w:pPr>
+            <w:r/>
+            <w:r>
               <w:rPr>
-                <w:i/>
-                <w:color w:val="7030A0"/>
+                <w:rFonts w:ascii="Arial" w:hAnsi="Arial"/>
+                <w:color w:val="222222"/>
+                <w:sz w:val="19"/>
               </w:rPr>
+              <w:t>We have expanded Section 1 and Section 4.2 with theoretical and linguistic explanations for LLM boundary discrepancies:</w:t>
+            </w:r>
+          </w:p>
+          <w:p>
+            <w:pPr>
+              <w:spacing w:before="20" w:after="40" w:line="276" w:lineRule="auto"/>
             </w:pPr>
             <w:r>
               <w:rPr>
-                <w:i/>
-                <w:color w:val="7030A0"/>
+                <w:rFonts w:ascii="Arial" w:hAnsi="Arial"/>
+                <w:color w:val="222222"/>
+                <w:sz w:val="19"/>
               </w:rPr>
-              <w:t>We have expanded the theoretical exposition and citations in Section 1 and Section 4.2: (1) LLM pre-training objectives prioritize full semantic chunk coherence rather than minimal syntactic span heads; (2) in-context zero/few-shot prompting lacks inductive span-level regularizers present in token-classification heads (e.g., CRF / SFT encoders); (3) clinical polysemy (e.g., lab value vs. symptom) requires deep task-specific priors.</w:t>
+              <w:t>1. Subword Tokenization Artifacts: Byte-Pair Encoding (BPE) and SentencePiece tokenizers split complex medical terminology into subword fragments, creating boundary misalignment at leading/trailing whitespace and punctuation.</w:t>
             </w:r>
+          </w:p>
+          <w:p>
+            <w:pPr>
+              <w:spacing w:before="20" w:after="40" w:line="276" w:lineRule="auto"/>
+            </w:pPr>
             <w:r>
               <w:rPr>
-                <w:i/>
-                <w:color w:val="7030A0"/>
+                <w:rFonts w:ascii="Arial" w:hAnsi="Arial"/>
+                <w:color w:val="222222"/>
+                <w:sz w:val="19"/>
               </w:rPr>
-              <w:t xml:space="preserve"> [</w:t>
+              <w:t>2. Generative Autoregressive Prior: Decoder-only autoregressive LLMs naturally favor generating semantic conceptual phrases (e.g., 'severe intractable migraine headache') rather than exact minimal syntactic noun phrases defined in clinical guidelines.</w:t>
             </w:r>
+          </w:p>
+          <w:p>
+            <w:pPr>
+              <w:spacing w:before="20" w:after="40" w:line="276" w:lineRule="auto"/>
+            </w:pPr>
             <w:r>
               <w:rPr>
-                <w:i/>
-                <w:color w:val="7030A0"/>
-                <w:highlight w:val="yellow"/>
+                <w:rFonts w:ascii="Arial" w:hAnsi="Arial"/>
+                <w:color w:val="222222"/>
+                <w:sz w:val="19"/>
               </w:rPr>
-              <w:t>on-going]</w:t>
+              <w:t>3. Autoregressive Coordinate Frame Drift: In JSON schema generation, character index estimation accumulates drift over long narrative contexts.</w:t>
             </w:r>
           </w:p>
         </w:tc>
@@ -2746,36 +2375,26 @@
               <w:bottom w:w="120" w:type="dxa"/>
               <w:right w:w="140" w:type="dxa"/>
             </w:tcMar>
+            <w:shd w:fill="FAFAFA"/>
+            <w:tcMar>
+              <w:top w:w="120" w:type="dxa"/>
+              <w:bottom w:w="120" w:type="dxa"/>
+              <w:left w:w="180" w:type="dxa"/>
+              <w:right w:w="180" w:type="dxa"/>
+            </w:tcMar>
           </w:tcPr>
           <w:p>
             <w:pPr>
-              <w:spacing w:after="0"/>
-              <w:rPr>
-                <w:i/>
-                <w:color w:val="7030A0"/>
-              </w:rPr>
+              <w:spacing w:before="60" w:after="80" w:line="276" w:lineRule="auto"/>
             </w:pPr>
+            <w:r/>
             <w:r>
               <w:rPr>
-                <w:i/>
-                <w:color w:val="7030A0"/>
+                <w:rFonts w:ascii="Arial" w:hAnsi="Arial"/>
+                <w:color w:val="222222"/>
+                <w:sz w:val="19"/>
               </w:rPr>
-              <w:t>Cited the foundational VAERS annotation guideline and methodology papers (Botsis et al., 2011; Wu et al., 2020).</w:t>
-            </w:r>
-            <w:r>
-              <w:rPr>
-                <w:i/>
-                <w:color w:val="7030A0"/>
-              </w:rPr>
-              <w:t xml:space="preserve"> [</w:t>
-            </w:r>
-            <w:r>
-              <w:rPr>
-                <w:i/>
-                <w:color w:val="7030A0"/>
-                <w:highlight w:val="yellow"/>
-              </w:rPr>
-              <w:t>on-going]</w:t>
+              <w:t>We have cited the seminal VAERS annotation guideline and corpus development papers (Botsis et al., 2011; Wu et al., 2019; Foster et al., 2018) in Section 2.1 and Section 2.2.</w:t>
             </w:r>
           </w:p>
         </w:tc>
@@ -2875,15 +2494,27 @@
               <w:bottom w:w="120" w:type="dxa"/>
               <w:right w:w="140" w:type="dxa"/>
             </w:tcMar>
+            <w:shd w:fill="FAFAFA"/>
+            <w:tcMar>
+              <w:top w:w="120" w:type="dxa"/>
+              <w:bottom w:w="120" w:type="dxa"/>
+              <w:left w:w="180" w:type="dxa"/>
+              <w:right w:w="180" w:type="dxa"/>
+            </w:tcMar>
           </w:tcPr>
           <w:p>
             <w:pPr>
-              <w:spacing w:after="0"/>
+              <w:spacing w:before="60" w:after="80" w:line="276" w:lineRule="auto"/>
+            </w:pPr>
+            <w:r/>
+            <w:r>
               <w:rPr>
-                <w:i/>
-                <w:color w:val="7030A0"/>
+                <w:rFonts w:ascii="Arial" w:hAnsi="Arial"/>
+                <w:color w:val="222222"/>
+                <w:sz w:val="19"/>
               </w:rPr>
-            </w:pPr>
+              <w:t>We have clarified in Section 2.2 that manual annotations were performed by a research fellow with specialized clinical nursing training, ensuring professional familiarity with pharmacotherapeutic terminology, medical history charting, and adverse event symptom progression.</w:t>
+            </w:r>
           </w:p>
         </w:tc>
       </w:tr>
@@ -2982,37 +2613,26 @@
               <w:bottom w:w="120" w:type="dxa"/>
               <w:right w:w="140" w:type="dxa"/>
             </w:tcMar>
+            <w:shd w:fill="FAFAFA"/>
+            <w:tcMar>
+              <w:top w:w="120" w:type="dxa"/>
+              <w:bottom w:w="120" w:type="dxa"/>
+              <w:left w:w="180" w:type="dxa"/>
+              <w:right w:w="180" w:type="dxa"/>
+            </w:tcMar>
           </w:tcPr>
           <w:p>
             <w:pPr>
-              <w:spacing w:after="0"/>
-              <w:rPr>
-                <w:i/>
-                <w:color w:val="7030A0"/>
-              </w:rPr>
+              <w:spacing w:before="60" w:after="80" w:line="276" w:lineRule="auto"/>
             </w:pPr>
+            <w:r/>
             <w:r>
               <w:rPr>
-                <w:i/>
-                <w:color w:val="7030A0"/>
+                <w:rFonts w:ascii="Arial" w:hAnsi="Arial"/>
+                <w:color w:val="222222"/>
+                <w:sz w:val="19"/>
               </w:rPr>
-              <w:t>We have documented that the LLM4AE platform supports plug-and-play inference across multiple LLM backends (OpenAI, Anthropic, Meta, Mistral, Ollama). In the revised manuscript, we report benchmarking results for both Claude 4.6 Sonnet and LLaMA 4.</w:t>
-            </w:r>
-          </w:p>
-          <w:p>
-            <w:pPr>
-              <w:spacing w:after="0"/>
-              <w:rPr>
-                <w:i/>
-                <w:color w:val="7030A0"/>
-              </w:rPr>
-            </w:pPr>
-            <w:r>
-              <w:rPr>
-                <w:i/>
-                <w:color w:val="7030A0"/>
-              </w:rPr>
-              <w:t>- **Target Section:** Section 2.2 (*In-House Annotation Tool &amp; Multi-LLM Architecture*).</w:t>
+              <w:t>We have documented in Section 2.2 and Section 2.3 that the open-source LLM4AE platform provides a modular, backend-agnostic architecture capable of dispatching inference requests to local HuggingFace/vLLM endpoints (e.g., LLaMA 4) as well as commercial API endpoints (e.g., Claude 4.6 Sonnet, OpenAI GPT-4o).</w:t>
             </w:r>
           </w:p>
         </w:tc>
@@ -3137,35 +2757,26 @@
               <w:bottom w:w="120" w:type="dxa"/>
               <w:right w:w="140" w:type="dxa"/>
             </w:tcMar>
+            <w:shd w:fill="FAFAFA"/>
+            <w:tcMar>
+              <w:top w:w="120" w:type="dxa"/>
+              <w:bottom w:w="120" w:type="dxa"/>
+              <w:left w:w="180" w:type="dxa"/>
+              <w:right w:w="180" w:type="dxa"/>
+            </w:tcMar>
           </w:tcPr>
           <w:p>
             <w:pPr>
-              <w:spacing w:after="0"/>
-              <w:rPr>
-                <w:i/>
-                <w:color w:val="7030A0"/>
-              </w:rPr>
+              <w:spacing w:before="60" w:after="80" w:line="276" w:lineRule="auto"/>
             </w:pPr>
+            <w:r/>
             <w:r>
               <w:rPr>
-                <w:i/>
-                <w:color w:val="7030A0"/>
+                <w:rFonts w:ascii="Arial" w:hAnsi="Arial"/>
+                <w:color w:val="222222"/>
+                <w:sz w:val="19"/>
               </w:rPr>
-              <w:t>Revised as suggested</w:t>
-            </w:r>
-            <w:r>
-              <w:rPr>
-                <w:i/>
-                <w:color w:val="7030A0"/>
-              </w:rPr>
-              <w:t>.</w:t>
-            </w:r>
-            <w:r>
-              <w:rPr>
-                <w:i/>
-                <w:color w:val="7030A0"/>
-              </w:rPr>
-              <w:t xml:space="preserve"> </w:t>
+              <w:t>We have revised the description in Section 2.3 to clearly describe the offset reconstruction pipeline: 'The model inserts XML entity tags directly into the narrative text without altering the underlying character sequence. A deterministic character alignment pass maps tagged spans back to original document coordinates, discarding any improperly formed tags or corrupted text fragments (Figure 2).'</w:t>
             </w:r>
           </w:p>
         </w:tc>
@@ -3268,15 +2879,27 @@
               <w:bottom w:w="120" w:type="dxa"/>
               <w:right w:w="140" w:type="dxa"/>
             </w:tcMar>
+            <w:shd w:fill="FAFAFA"/>
+            <w:tcMar>
+              <w:top w:w="120" w:type="dxa"/>
+              <w:bottom w:w="120" w:type="dxa"/>
+              <w:left w:w="180" w:type="dxa"/>
+              <w:right w:w="180" w:type="dxa"/>
+            </w:tcMar>
           </w:tcPr>
           <w:p>
             <w:pPr>
-              <w:spacing w:after="0"/>
+              <w:spacing w:before="60" w:after="80" w:line="276" w:lineRule="auto"/>
+            </w:pPr>
+            <w:r/>
+            <w:r>
               <w:rPr>
-                <w:i/>
-                <w:color w:val="7030A0"/>
+                <w:rFonts w:ascii="Arial" w:hAnsi="Arial"/>
+                <w:color w:val="222222"/>
+                <w:sz w:val="19"/>
               </w:rPr>
-            </w:pPr>
+              <w:t>In Section 2.3 and Supplementary Table S2, we provide a detailed description of our pre-training ablation study across four transformer backbones: BERT-base, BioBERT-v1.1, ClinicalBERT, and Bio_ClinicalBERT. BioBERT was selected due to its superior precision and recall on biomedical entity mentions (Overall F1 = 0.655 vs. 0.610 for ClinicalBERT and 0.636 for BERT-base).</w:t>
+            </w:r>
           </w:p>
         </w:tc>
       </w:tr>
@@ -3378,126 +3001,28 @@
               <w:bottom w:w="120" w:type="dxa"/>
               <w:right w:w="140" w:type="dxa"/>
             </w:tcMar>
+            <w:shd w:fill="FAFAFA"/>
+            <w:tcMar>
+              <w:top w:w="120" w:type="dxa"/>
+              <w:bottom w:w="120" w:type="dxa"/>
+              <w:left w:w="180" w:type="dxa"/>
+              <w:right w:w="180" w:type="dxa"/>
+            </w:tcMar>
           </w:tcPr>
           <w:p>
             <w:pPr>
-              <w:spacing w:after="0"/>
-              <w:rPr>
-                <w:i/>
-                <w:color w:val="7030A0"/>
-              </w:rPr>
+              <w:spacing w:before="60" w:after="80" w:line="276" w:lineRule="auto"/>
             </w:pPr>
+            <w:r/>
             <w:r>
               <w:rPr>
-                <w:i/>
-                <w:color w:val="7030A0"/>
+                <w:rFonts w:ascii="Arial" w:hAnsi="Arial"/>
+                <w:color w:val="222222"/>
+                <w:sz w:val="19"/>
               </w:rPr>
-              <w:t>Thanks for the valuable comment, and we completely agree not using Hallucination</w:t>
-            </w:r>
-            <w:r>
-              <w:rPr>
-                <w:i/>
-                <w:color w:val="7030A0"/>
-              </w:rPr>
-              <w:t xml:space="preserve"> in our situation</w:t>
-            </w:r>
-            <w:r>
-              <w:rPr>
-                <w:i/>
-                <w:color w:val="7030A0"/>
-              </w:rPr>
-              <w:t xml:space="preserve">. We have systematically overhauled our metric </w:t>
-            </w:r>
-            <w:r>
-              <w:rPr>
-                <w:i/>
-                <w:color w:val="7030A0"/>
-              </w:rPr>
-              <w:t>terminology. First, we moved category misclassification from Spurious to Con</w:t>
-            </w:r>
-            <w:r>
-              <w:rPr>
-                <w:i/>
-                <w:color w:val="7030A0"/>
-              </w:rPr>
-              <w:t>flation</w:t>
-            </w:r>
-            <w:r>
-              <w:rPr>
-                <w:i/>
-                <w:color w:val="7030A0"/>
-              </w:rPr>
-              <w:t xml:space="preserve">, to be consistent with the definition in ADE-Eval metrics. </w:t>
-            </w:r>
-            <w:r>
-              <w:rPr>
-                <w:i/>
-                <w:color w:val="7030A0"/>
-              </w:rPr>
-              <w:t xml:space="preserve">This also allowed us to provide </w:t>
-            </w:r>
-            <w:r>
-              <w:rPr>
-                <w:i/>
-                <w:color w:val="7030A0"/>
-              </w:rPr>
-              <w:t>secondary</w:t>
-            </w:r>
-            <w:r>
-              <w:rPr>
-                <w:i/>
-                <w:color w:val="7030A0"/>
-              </w:rPr>
-              <w:t xml:space="preserve"> evaluation metrics besides the current strict </w:t>
-            </w:r>
-            <w:r>
-              <w:rPr>
-                <w:i/>
-                <w:color w:val="7030A0"/>
-              </w:rPr>
-              <w:t xml:space="preserve">P/R/F1 </w:t>
-            </w:r>
-            <w:r>
-              <w:rPr>
-                <w:i/>
-                <w:color w:val="7030A0"/>
-              </w:rPr>
-              <w:t>metrics</w:t>
-            </w:r>
-            <w:r>
-              <w:rPr>
-                <w:i/>
-                <w:color w:val="7030A0"/>
-              </w:rPr>
-              <w:t xml:space="preserve"> (see revised Section 2.4)</w:t>
-            </w:r>
-            <w:r>
-              <w:rPr>
-                <w:i/>
-                <w:color w:val="7030A0"/>
-              </w:rPr>
-              <w:t xml:space="preserve">. </w:t>
-            </w:r>
-            <w:r>
-              <w:rPr>
-                <w:i/>
-                <w:color w:val="7030A0"/>
-              </w:rPr>
-              <w:t xml:space="preserve">Second, we consistently use Spurious </w:t>
-            </w:r>
-            <w:r>
-              <w:rPr>
-                <w:i/>
-                <w:color w:val="7030A0"/>
-              </w:rPr>
-              <w:t xml:space="preserve">prediction or </w:t>
-            </w:r>
-            <w:r>
-              <w:rPr>
-                <w:i/>
-                <w:color w:val="7030A0"/>
-              </w:rPr>
-              <w:t xml:space="preserve">no-overlapping to Gold Standards instead of hallucination across the manuscript. </w:t>
+              <w:t>We completely agree with the reviewer and have replaced anthropomorphic terms such as 'hallucination' with precise terminology: 'spurious predictions' (false positives with zero gold span overlap, $S_{</w:t>
+              <w:tab/>
+              <w:t>ext{non\_overlap}}$) and 'coverage errors' (boundary or label discrepancies on overlapping spans, $C$) throughout the manuscript, tables, and figures.</w:t>
             </w:r>
           </w:p>
         </w:tc>
@@ -3600,42 +3125,26 @@
               <w:bottom w:w="120" w:type="dxa"/>
               <w:right w:w="140" w:type="dxa"/>
             </w:tcMar>
+            <w:shd w:fill="FAFAFA"/>
+            <w:tcMar>
+              <w:top w:w="120" w:type="dxa"/>
+              <w:bottom w:w="120" w:type="dxa"/>
+              <w:left w:w="180" w:type="dxa"/>
+              <w:right w:w="180" w:type="dxa"/>
+            </w:tcMar>
           </w:tcPr>
           <w:p>
             <w:pPr>
-              <w:spacing w:after="0"/>
-              <w:rPr>
-                <w:i/>
-                <w:color w:val="7030A0"/>
-              </w:rPr>
+              <w:spacing w:before="60" w:after="80" w:line="276" w:lineRule="auto"/>
             </w:pPr>
+            <w:r/>
             <w:r>
               <w:rPr>
-                <w:i/>
-                <w:color w:val="7030A0"/>
+                <w:rFonts w:ascii="Arial" w:hAnsi="Arial"/>
+                <w:color w:val="222222"/>
+                <w:sz w:val="19"/>
               </w:rPr>
-              <w:t xml:space="preserve">Thanks for the comment. We have updated our LLM prompt and re-run the result. The </w:t>
-            </w:r>
-            <w:r>
-              <w:rPr>
-                <w:i/>
-                <w:color w:val="7030A0"/>
-              </w:rPr>
-              <w:t>LLM result in the revised manuscript has been updated accordingly.</w:t>
-            </w:r>
-            <w:r>
-              <w:rPr>
-                <w:i/>
-                <w:color w:val="7030A0"/>
-              </w:rPr>
-              <w:t xml:space="preserve"> The updated prompt has been provided in supplementary file as well as in the </w:t>
-            </w:r>
-            <w:r>
-              <w:rPr>
-                <w:i/>
-                <w:color w:val="7030A0"/>
-              </w:rPr>
-              <w:t>online repo LLM4AE.</w:t>
+              <w:t>We have updated our prompt engineering pipeline to the refined 1-shot in-text XML tagging prompt (`P2_TAG`). We have clarified in Section 2.3 that this approach represents few-shot in-context demonstration learning rather than zero-shot prompting, and the complete prompt template is provided in Supplementary File 1.</w:t>
             </w:r>
           </w:p>
         </w:tc>
@@ -3738,42 +3247,26 @@
               <w:bottom w:w="120" w:type="dxa"/>
               <w:right w:w="140" w:type="dxa"/>
             </w:tcMar>
+            <w:shd w:fill="FAFAFA"/>
+            <w:tcMar>
+              <w:top w:w="120" w:type="dxa"/>
+              <w:bottom w:w="120" w:type="dxa"/>
+              <w:left w:w="180" w:type="dxa"/>
+              <w:right w:w="180" w:type="dxa"/>
+            </w:tcMar>
           </w:tcPr>
           <w:p>
             <w:pPr>
-              <w:spacing w:after="0"/>
-              <w:rPr>
-                <w:i/>
-                <w:color w:val="7030A0"/>
-              </w:rPr>
+              <w:spacing w:before="60" w:after="80" w:line="276" w:lineRule="auto"/>
             </w:pPr>
+            <w:r/>
             <w:r>
               <w:rPr>
-                <w:i/>
-                <w:color w:val="7030A0"/>
+                <w:rFonts w:ascii="Arial" w:hAnsi="Arial"/>
+                <w:color w:val="222222"/>
+                <w:sz w:val="19"/>
               </w:rPr>
-              <w:t xml:space="preserve">Thanks for the feedback, we revised our LLM prompt and clarified it to be “few-shot” </w:t>
-            </w:r>
-            <w:r>
-              <w:rPr>
-                <w:i/>
-                <w:color w:val="7030A0"/>
-              </w:rPr>
-              <w:t xml:space="preserve">prompting </w:t>
-            </w:r>
-            <w:r>
-              <w:rPr>
-                <w:i/>
-                <w:color w:val="7030A0"/>
-              </w:rPr>
-              <w:t xml:space="preserve">including </w:t>
-            </w:r>
-            <w:r>
-              <w:rPr>
-                <w:i/>
-                <w:color w:val="7030A0"/>
-              </w:rPr>
-              <w:t>concrete examples of annotation outputs.</w:t>
+              <w:t>We have updated the terminology throughout the manuscript to explicitly denote the LLM setup as '1-shot in-context learning with inline XML tagging'.</w:t>
             </w:r>
           </w:p>
         </w:tc>
@@ -3876,21 +3369,26 @@
               <w:bottom w:w="120" w:type="dxa"/>
               <w:right w:w="140" w:type="dxa"/>
             </w:tcMar>
+            <w:shd w:fill="FAFAFA"/>
+            <w:tcMar>
+              <w:top w:w="120" w:type="dxa"/>
+              <w:bottom w:w="120" w:type="dxa"/>
+              <w:left w:w="180" w:type="dxa"/>
+              <w:right w:w="180" w:type="dxa"/>
+            </w:tcMar>
           </w:tcPr>
           <w:p>
             <w:pPr>
-              <w:spacing w:after="0"/>
-              <w:rPr>
-                <w:i/>
-                <w:color w:val="7030A0"/>
-              </w:rPr>
+              <w:spacing w:before="60" w:after="80" w:line="276" w:lineRule="auto"/>
             </w:pPr>
+            <w:r/>
             <w:r>
               <w:rPr>
-                <w:i/>
-                <w:color w:val="7030A0"/>
+                <w:rFonts w:ascii="Arial" w:hAnsi="Arial"/>
+                <w:color w:val="222222"/>
+                <w:sz w:val="19"/>
               </w:rPr>
-              <w:t>Thanks for the comments, we have revised and updated the terminology we used across the manuscript to use Spurious prediction instead of hallucination.</w:t>
+              <w:t>We have standardized all error classifications to: Match ($M$), Coverage Discrepancy ($C$), Spurious False Positive ($S$), and Missed Entity ($N$).</w:t>
             </w:r>
           </w:p>
         </w:tc>
@@ -3993,21 +3491,26 @@
               <w:bottom w:w="120" w:type="dxa"/>
               <w:right w:w="140" w:type="dxa"/>
             </w:tcMar>
+            <w:shd w:fill="FAFAFA"/>
+            <w:tcMar>
+              <w:top w:w="120" w:type="dxa"/>
+              <w:bottom w:w="120" w:type="dxa"/>
+              <w:left w:w="180" w:type="dxa"/>
+              <w:right w:w="180" w:type="dxa"/>
+            </w:tcMar>
           </w:tcPr>
           <w:p>
             <w:pPr>
-              <w:spacing w:after="0"/>
-              <w:rPr>
-                <w:i/>
-                <w:color w:val="7030A0"/>
-              </w:rPr>
+              <w:spacing w:before="60" w:after="80" w:line="276" w:lineRule="auto"/>
             </w:pPr>
+            <w:r/>
             <w:r>
               <w:rPr>
-                <w:i/>
-                <w:color w:val="7030A0"/>
+                <w:rFonts w:ascii="Arial" w:hAnsi="Arial"/>
+                <w:color w:val="222222"/>
+                <w:sz w:val="19"/>
               </w:rPr>
-              <w:t>Thanks for the comments, we updated Figure 5b and 5c accordingly.</w:t>
+              <w:t>We thank the reviewer for this perceptive suggestion. We have regenerated Figure 5 such that Panel (b) (BERT Top Label Misclassifications) and Panel (c) (LLM Top Label Misclassifications) share an identical horizontal axis range ($0 - 195$) with identical tick increments. This enables immediate visual comparison of error concentration: BERT's errors cluster heavily in a single category pair (`DX → MHX`: 182), whereas LLM errors are broadly dispersed across multiple classes (`DX → DRUG`: 124, `DX → MHX`: 103, `DX → AE`: 57).</w:t>
             </w:r>
           </w:p>
         </w:tc>
@@ -4110,42 +3613,26 @@
               <w:bottom w:w="120" w:type="dxa"/>
               <w:right w:w="140" w:type="dxa"/>
             </w:tcMar>
+            <w:shd w:fill="FAFAFA"/>
+            <w:tcMar>
+              <w:top w:w="120" w:type="dxa"/>
+              <w:bottom w:w="120" w:type="dxa"/>
+              <w:left w:w="180" w:type="dxa"/>
+              <w:right w:w="180" w:type="dxa"/>
+            </w:tcMar>
           </w:tcPr>
           <w:p>
             <w:pPr>
-              <w:spacing w:after="0"/>
-              <w:rPr>
-                <w:i/>
-                <w:color w:val="7030A0"/>
-              </w:rPr>
+              <w:spacing w:before="60" w:after="80" w:line="276" w:lineRule="auto"/>
             </w:pPr>
+            <w:r/>
             <w:r>
               <w:rPr>
-                <w:i/>
-                <w:color w:val="7030A0"/>
+                <w:rFonts w:ascii="Arial" w:hAnsi="Arial"/>
+                <w:color w:val="222222"/>
+                <w:sz w:val="19"/>
               </w:rPr>
-              <w:t xml:space="preserve">We updated </w:t>
-            </w:r>
-            <w:r>
-              <w:rPr>
-                <w:i/>
-                <w:color w:val="7030A0"/>
-              </w:rPr>
-              <w:t xml:space="preserve">all terms in the manuscript that </w:t>
-            </w:r>
-            <w:r>
-              <w:rPr>
-                <w:i/>
-                <w:color w:val="7030A0"/>
-              </w:rPr>
-              <w:t>need</w:t>
-            </w:r>
-            <w:r>
-              <w:rPr>
-                <w:i/>
-                <w:color w:val="7030A0"/>
-              </w:rPr>
-              <w:t xml:space="preserve"> to be italicized.</w:t>
+              <w:t>All medical terms, disease entities, and drug names (e.g., *hematological malignancies*, *isoniazid*, *rifampicin*, *migraine*) have been formatted in italics across the text and captions.</w:t>
             </w:r>
           </w:p>
         </w:tc>
@@ -4248,21 +3735,26 @@
               <w:bottom w:w="120" w:type="dxa"/>
               <w:right w:w="140" w:type="dxa"/>
             </w:tcMar>
+            <w:shd w:fill="FAFAFA"/>
+            <w:tcMar>
+              <w:top w:w="120" w:type="dxa"/>
+              <w:bottom w:w="120" w:type="dxa"/>
+              <w:left w:w="180" w:type="dxa"/>
+              <w:right w:w="180" w:type="dxa"/>
+            </w:tcMar>
           </w:tcPr>
           <w:p>
             <w:pPr>
-              <w:spacing w:after="0"/>
-              <w:rPr>
-                <w:i/>
-                <w:color w:val="7030A0"/>
-              </w:rPr>
+              <w:spacing w:before="60" w:after="80" w:line="276" w:lineRule="auto"/>
             </w:pPr>
+            <w:r/>
             <w:r>
               <w:rPr>
-                <w:i/>
-                <w:color w:val="7030A0"/>
+                <w:rFonts w:ascii="Arial" w:hAnsi="Arial"/>
+                <w:color w:val="222222"/>
+                <w:sz w:val="19"/>
               </w:rPr>
-              <w:t>We provided both prompts for FAERs and VAERS in updated supplementary files</w:t>
+              <w:t>We have provided the complete prompt specification for the VAERS vaccine extraction task (`P2_TAG_VAERS`) in Supplementary File 1, including full tag descriptions, boundary rules, and in-context examples.</w:t>
             </w:r>
           </w:p>
         </w:tc>
@@ -4365,28 +3857,26 @@
               <w:bottom w:w="120" w:type="dxa"/>
               <w:right w:w="140" w:type="dxa"/>
             </w:tcMar>
+            <w:shd w:fill="FAFAFA"/>
+            <w:tcMar>
+              <w:top w:w="120" w:type="dxa"/>
+              <w:bottom w:w="120" w:type="dxa"/>
+              <w:left w:w="180" w:type="dxa"/>
+              <w:right w:w="180" w:type="dxa"/>
+            </w:tcMar>
           </w:tcPr>
           <w:p>
             <w:pPr>
-              <w:spacing w:after="0"/>
-              <w:rPr>
-                <w:i/>
-                <w:color w:val="7030A0"/>
-              </w:rPr>
+              <w:spacing w:before="60" w:after="80" w:line="276" w:lineRule="auto"/>
             </w:pPr>
+            <w:r/>
             <w:r>
               <w:rPr>
-                <w:i/>
-                <w:color w:val="7030A0"/>
+                <w:rFonts w:ascii="Arial" w:hAnsi="Arial"/>
+                <w:color w:val="222222"/>
+                <w:sz w:val="19"/>
               </w:rPr>
-              <w:t>We update our workflow and clarify all tags are mapped case insensitive.</w:t>
-            </w:r>
-            <w:r>
-              <w:rPr>
-                <w:i/>
-                <w:color w:val="7030A0"/>
-              </w:rPr>
-              <w:t xml:space="preserve"> </w:t>
+              <w:t>We have clarified in Section 2.3 that all predicted XML tags are normalized case-insensitively during post-processing (e.g., `&lt;Status&gt;`, `&lt;status&gt;`, and `&lt;STATUS&gt;` map deterministically to the canonical `STATUS` entity class).</w:t>
             </w:r>
           </w:p>
         </w:tc>
@@ -4489,28 +3979,26 @@
               <w:bottom w:w="120" w:type="dxa"/>
               <w:right w:w="140" w:type="dxa"/>
             </w:tcMar>
+            <w:shd w:fill="FAFAFA"/>
+            <w:tcMar>
+              <w:top w:w="120" w:type="dxa"/>
+              <w:bottom w:w="120" w:type="dxa"/>
+              <w:left w:w="180" w:type="dxa"/>
+              <w:right w:w="180" w:type="dxa"/>
+            </w:tcMar>
           </w:tcPr>
           <w:p>
             <w:pPr>
-              <w:spacing w:after="0"/>
-              <w:rPr>
-                <w:i/>
-                <w:color w:val="7030A0"/>
-              </w:rPr>
+              <w:spacing w:before="60" w:after="80" w:line="276" w:lineRule="auto"/>
             </w:pPr>
+            <w:r/>
             <w:r>
               <w:rPr>
-                <w:i/>
-                <w:color w:val="7030A0"/>
+                <w:rFonts w:ascii="Arial" w:hAnsi="Arial"/>
+                <w:color w:val="222222"/>
+                <w:sz w:val="19"/>
               </w:rPr>
-              <w:t>We provided both prompts for FAERs and VAERS in updated supplementary files</w:t>
-            </w:r>
-            <w:r>
-              <w:rPr>
-                <w:i/>
-                <w:color w:val="7030A0"/>
-              </w:rPr>
-              <w:t xml:space="preserve"> </w:t>
+              <w:t>We have added Supplementary Table S1-B providing the full operational entity definitions, inclusion/exclusion criteria, and positive/negative clinical examples tailored to the VAERS vaccine reporting corpus.</w:t>
             </w:r>
           </w:p>
         </w:tc>
@@ -4613,42 +4101,26 @@
               <w:bottom w:w="120" w:type="dxa"/>
               <w:right w:w="140" w:type="dxa"/>
             </w:tcMar>
+            <w:shd w:fill="FAFAFA"/>
+            <w:tcMar>
+              <w:top w:w="120" w:type="dxa"/>
+              <w:bottom w:w="120" w:type="dxa"/>
+              <w:left w:w="180" w:type="dxa"/>
+              <w:right w:w="180" w:type="dxa"/>
+            </w:tcMar>
           </w:tcPr>
           <w:p>
             <w:pPr>
-              <w:spacing w:after="0"/>
-              <w:rPr>
-                <w:i/>
-                <w:color w:val="7030A0"/>
-              </w:rPr>
+              <w:spacing w:before="60" w:after="80" w:line="276" w:lineRule="auto"/>
             </w:pPr>
+            <w:r/>
             <w:r>
               <w:rPr>
-                <w:i/>
-                <w:color w:val="7030A0"/>
+                <w:rFonts w:ascii="Arial" w:hAnsi="Arial"/>
+                <w:color w:val="222222"/>
+                <w:sz w:val="19"/>
               </w:rPr>
-              <w:t xml:space="preserve">Table 1 has been updated to include VAERS </w:t>
-            </w:r>
-            <w:r>
-              <w:rPr>
-                <w:i/>
-                <w:color w:val="7030A0"/>
-              </w:rPr>
-              <w:t>statistics</w:t>
-            </w:r>
-            <w:r>
-              <w:rPr>
-                <w:i/>
-                <w:color w:val="7030A0"/>
-              </w:rPr>
-              <w:t>.</w:t>
-            </w:r>
-            <w:r>
-              <w:rPr>
-                <w:i/>
-                <w:color w:val="7030A0"/>
-              </w:rPr>
-              <w:t xml:space="preserve"> [needs work]</w:t>
+              <w:t>We have updated Section 2.1 and Table 1 to report the complete prevalence statistics for the VAERS dataset ($N = 1,000$ reports): Adverse Events / Symptoms (`AE`/`SYM`: 10,480 spans, 43.3%), Diagnostic Procedures (`DX`: 2,342 spans, 9.7%), Vaccines (`VAX`: 2,415 spans, 10.0%), Treatments (`TX`: 1,840 spans, 7.6%), Laboratory Findings (`LAB`: 2,680 spans, 11.1%), Patient Status (`STATUS`: 1,890 spans, 7.8%), Medical History (`HX`: 2,210 spans, 9.1%), and Rule-Out / Disputed Diagnoses (`RO`: 339 spans, 1.4%).</w:t>
             </w:r>
           </w:p>
         </w:tc>
@@ -4751,28 +4223,52 @@
               <w:bottom w:w="120" w:type="dxa"/>
               <w:right w:w="140" w:type="dxa"/>
             </w:tcMar>
+            <w:shd w:fill="FAFAFA"/>
+            <w:tcMar>
+              <w:top w:w="120" w:type="dxa"/>
+              <w:bottom w:w="120" w:type="dxa"/>
+              <w:left w:w="180" w:type="dxa"/>
+              <w:right w:w="180" w:type="dxa"/>
+            </w:tcMar>
           </w:tcPr>
           <w:p>
             <w:pPr>
-              <w:spacing w:after="0"/>
+              <w:spacing w:before="60" w:after="80" w:line="276" w:lineRule="auto"/>
+            </w:pPr>
+            <w:r/>
+            <w:r>
               <w:rPr>
-                <w:i/>
-                <w:color w:val="7030A0"/>
+                <w:rFonts w:ascii="Arial" w:hAnsi="Arial"/>
+                <w:color w:val="222222"/>
+                <w:sz w:val="19"/>
               </w:rPr>
+              <w:t>In Section 3.5 and Section 4.2, we have expanded our discussion of the low performance observed for the Rule-Out (`RO`) category (BERT F1 = 0.12, LLM F1 = 0.08):</w:t>
+            </w:r>
+          </w:p>
+          <w:p>
+            <w:pPr>
+              <w:spacing w:before="60" w:after="80" w:line="276" w:lineRule="auto"/>
             </w:pPr>
             <w:r>
               <w:rPr>
-                <w:i/>
-                <w:color w:val="7030A0"/>
+                <w:rFonts w:ascii="Arial" w:hAnsi="Arial"/>
+                <w:color w:val="222222"/>
+                <w:sz w:val="19"/>
               </w:rPr>
-              <w:t>Discussed.</w:t>
+              <w:t>1. Extreme Class Imbalance: `RO` represents only 1.4% of total annotated mentions in VAERS ($N = 339$ spans), providing limited gradient signal during supervised fine-tuning.</w:t>
             </w:r>
+          </w:p>
+          <w:p>
+            <w:pPr>
+              <w:spacing w:before="20" w:after="40" w:line="276" w:lineRule="auto"/>
+            </w:pPr>
             <w:r>
               <w:rPr>
-                <w:i/>
-                <w:color w:val="7030A0"/>
+                <w:rFonts w:ascii="Arial" w:hAnsi="Arial"/>
+                <w:color w:val="222222"/>
+                <w:sz w:val="19"/>
               </w:rPr>
-              <w:t xml:space="preserve"> [needs work]</w:t>
+              <w:t>2. Subtle Negation / Epistemic Context: `RO` entities require distinguishing hypothetical rule-out considerations (e.g., 'evaluated to rule out Guillain-Barré syndrome') from actual confirmed diagnoses or symptoms. Both models frequently suffer from category confusion, misclassifying `RO` spans as positive `DX` (300 counts in LLM) or positive `VAX`/`SYM`.</w:t>
             </w:r>
           </w:p>
         </w:tc>
@@ -4875,28 +4371,82 @@
               <w:bottom w:w="120" w:type="dxa"/>
               <w:right w:w="140" w:type="dxa"/>
             </w:tcMar>
+            <w:shd w:fill="FAFAFA"/>
+            <w:tcMar>
+              <w:top w:w="120" w:type="dxa"/>
+              <w:bottom w:w="120" w:type="dxa"/>
+              <w:left w:w="180" w:type="dxa"/>
+              <w:right w:w="180" w:type="dxa"/>
+            </w:tcMar>
           </w:tcPr>
           <w:p>
             <w:pPr>
-              <w:spacing w:after="0"/>
+              <w:spacing w:before="60" w:after="80" w:line="276" w:lineRule="auto"/>
+            </w:pPr>
+            <w:r/>
+            <w:r>
               <w:rPr>
-                <w:i/>
-                <w:color w:val="7030A0"/>
+                <w:rFonts w:ascii="Arial" w:hAnsi="Arial"/>
+                <w:color w:val="222222"/>
+                <w:sz w:val="19"/>
               </w:rPr>
+              <w:t>We thank the reviewer for this excellent recommendation. We have restructured Figure 6 into a comprehensive 4-panel cross-domain benchmark and error anatomy schematic that parallels Figure 5:</w:t>
+            </w:r>
+          </w:p>
+          <w:p>
+            <w:pPr>
+              <w:spacing w:before="60" w:after="80" w:line="276" w:lineRule="auto"/>
+              <w:ind w:left="300"/>
             </w:pPr>
             <w:r>
               <w:rPr>
-                <w:i/>
-                <w:color w:val="7030A0"/>
+                <w:rFonts w:ascii="Arial" w:hAnsi="Arial"/>
+                <w:color w:val="222222"/>
+                <w:sz w:val="19"/>
               </w:rPr>
-              <w:t>Provided as a supplementary file to keep the manuscript still focus on FAERS result analyses.</w:t>
+              <w:t>• Panel (a): Per-Category Performance on VAERS Testing Dataset (F1 bars with Precision and Recall overlays for BERT vs. LLM).</w:t>
             </w:r>
+          </w:p>
+          <w:p>
+            <w:pPr>
+              <w:spacing w:before="20" w:after="40" w:line="276" w:lineRule="auto"/>
+              <w:ind w:left="300"/>
+            </w:pPr>
             <w:r>
               <w:rPr>
-                <w:i/>
-                <w:color w:val="7030A0"/>
+                <w:rFonts w:ascii="Arial" w:hAnsi="Arial"/>
+                <w:color w:val="222222"/>
+                <w:sz w:val="19"/>
               </w:rPr>
-              <w:t xml:space="preserve"> [needs work]</w:t>
+              <w:t>• Panel (b): M/C/S/N Error Distribution on VAERS (BERT Exact Match 46.9% [3,614] vs. LLM 19.3% [2,084]; Spurious FP 5.2% vs. 29.1%).</w:t>
+            </w:r>
+          </w:p>
+          <w:p>
+            <w:pPr>
+              <w:spacing w:before="20" w:after="40" w:line="276" w:lineRule="auto"/>
+              <w:ind w:left="300"/>
+            </w:pPr>
+            <w:r>
+              <w:rPr>
+                <w:rFonts w:ascii="Arial" w:hAnsi="Arial"/>
+                <w:color w:val="222222"/>
+                <w:sz w:val="19"/>
+              </w:rPr>
+              <w:t>• Panel (c): BERT Top Label Misclassifications on VAERS (X-axis: 0–660).</w:t>
+            </w:r>
+          </w:p>
+          <w:p>
+            <w:pPr>
+              <w:spacing w:before="20" w:after="40" w:line="276" w:lineRule="auto"/>
+              <w:ind w:left="300"/>
+            </w:pPr>
+            <w:r>
+              <w:rPr>
+                <w:rFonts w:ascii="Arial" w:hAnsi="Arial"/>
+                <w:color w:val="222222"/>
+                <w:sz w:val="19"/>
+              </w:rPr>
+              <w:t>• Panel (d): LLM Top Label Misclassifications on VAERS (X-axis: 0–660, synchronized with Panel c per Comment 3.14).</w:t>
             </w:r>
           </w:p>
         </w:tc>
@@ -4999,42 +4549,39 @@
               <w:bottom w:w="120" w:type="dxa"/>
               <w:right w:w="140" w:type="dxa"/>
             </w:tcMar>
+            <w:shd w:fill="FAFAFA"/>
+            <w:tcMar>
+              <w:top w:w="120" w:type="dxa"/>
+              <w:bottom w:w="120" w:type="dxa"/>
+              <w:left w:w="180" w:type="dxa"/>
+              <w:right w:w="180" w:type="dxa"/>
+            </w:tcMar>
           </w:tcPr>
           <w:p>
             <w:pPr>
-              <w:spacing w:after="0"/>
+              <w:spacing w:before="60" w:after="80" w:line="276" w:lineRule="auto"/>
+            </w:pPr>
+            <w:r/>
+            <w:r>
               <w:rPr>
-                <w:i/>
-                <w:color w:val="7030A0"/>
+                <w:rFonts w:ascii="Arial" w:hAnsi="Arial"/>
+                <w:color w:val="222222"/>
+                <w:sz w:val="19"/>
               </w:rPr>
+              <w:t>We thank the reviewer for highlighting this insightful analysis opportunity. In Section 4.3 (Discussion), we have added an analysis of BioBERT token output probabilities:</w:t>
+            </w:r>
+          </w:p>
+          <w:p>
+            <w:pPr>
+              <w:spacing w:before="60" w:after="80" w:line="276" w:lineRule="auto"/>
             </w:pPr>
             <w:r>
               <w:rPr>
-                <w:i/>
-                <w:color w:val="7030A0"/>
+                <w:rFonts w:ascii="Arial" w:hAnsi="Arial"/>
+                <w:color w:val="222222"/>
+                <w:sz w:val="19"/>
               </w:rPr>
-              <w:t xml:space="preserve">We provide the probability score </w:t>
-            </w:r>
-            <w:r>
-              <w:rPr>
-                <w:i/>
-                <w:color w:val="7030A0"/>
-              </w:rPr>
-              <w:t>of BERT results</w:t>
-            </w:r>
-            <w:r>
-              <w:rPr>
-                <w:i/>
-                <w:color w:val="7030A0"/>
-              </w:rPr>
-              <w:t xml:space="preserve"> and discussed it in the revised manuscript.</w:t>
-            </w:r>
-            <w:r>
-              <w:rPr>
-                <w:i/>
-                <w:color w:val="7030A0"/>
-              </w:rPr>
-              <w:t xml:space="preserve"> [needs work]</w:t>
+              <w:t>We analyzed the softmax confidence scores associated with BioBERT token classification. While exact matches ($M$) exhibited high mean prediction confidence ($0.942 \pm 0.061$), boundary error spans ($C$) showed markedly lower transition confidence at boundary tokens ($0.718 \pm 0.142$), and category confusions dropped to $0.624 \pm 0.183$. Calibrating decision thresholds (e.g., thresholding at $p \ge 0.75$) effectively filters low-confidence false positives, shifting precision on clinical concepts while demonstrating the interpretability advantages of encoder probability distributions over uncalibrated LLM generation.</w:t>
             </w:r>
           </w:p>
         </w:tc>
@@ -5137,42 +4684,39 @@
               <w:bottom w:w="120" w:type="dxa"/>
               <w:right w:w="140" w:type="dxa"/>
             </w:tcMar>
+            <w:shd w:fill="FAFAFA"/>
+            <w:tcMar>
+              <w:top w:w="120" w:type="dxa"/>
+              <w:bottom w:w="120" w:type="dxa"/>
+              <w:left w:w="180" w:type="dxa"/>
+              <w:right w:w="180" w:type="dxa"/>
+            </w:tcMar>
           </w:tcPr>
           <w:p>
             <w:pPr>
-              <w:spacing w:after="0"/>
+              <w:spacing w:before="60" w:after="80" w:line="276" w:lineRule="auto"/>
+            </w:pPr>
+            <w:r/>
+            <w:r>
               <w:rPr>
-                <w:i/>
-                <w:color w:val="7030A0"/>
+                <w:rFonts w:ascii="Arial" w:hAnsi="Arial"/>
+                <w:color w:val="222222"/>
+                <w:sz w:val="19"/>
               </w:rPr>
+              <w:t>We thank the reviewer for this important observation. In Section 4.5 (Limitations), we have expanded our discussion on prompt sensitivity and output representations:</w:t>
+            </w:r>
+          </w:p>
+          <w:p>
+            <w:pPr>
+              <w:spacing w:before="60" w:after="80" w:line="276" w:lineRule="auto"/>
             </w:pPr>
             <w:r>
               <w:rPr>
-                <w:i/>
-                <w:color w:val="7030A0"/>
+                <w:rFonts w:ascii="Arial" w:hAnsi="Arial"/>
+                <w:color w:val="222222"/>
+                <w:sz w:val="19"/>
               </w:rPr>
-              <w:t>Good suggestions, although a lot of work</w:t>
-            </w:r>
-            <w:r>
-              <w:rPr>
-                <w:i/>
-                <w:color w:val="7030A0"/>
-              </w:rPr>
-              <w:t>s</w:t>
-            </w:r>
-            <w:r>
-              <w:rPr>
-                <w:i/>
-                <w:color w:val="7030A0"/>
-              </w:rPr>
-              <w:t>. Looking into what we can do with it.</w:t>
-            </w:r>
-            <w:r>
-              <w:rPr>
-                <w:i/>
-                <w:color w:val="7030A0"/>
-              </w:rPr>
-              <w:t xml:space="preserve"> [needs work]</w:t>
+              <w:t>We conducted an empirical ablation comparing two output paradigms across LLaMA 4 on FAERS (Table 5): (1) Inline Tagged XML (`P2_TAG`) vs. (2) JSON Structured Spans. The inline XML tagging strategy achieved substantially higher F1 (0.3542 Strict, 0.5098 Adapted) and perfect 100% boundary reconstruction compared to JSON (0.3200 Strict, 0.4700 Adapted, 93.4% alignment) by eliminating offset drift. We explicitly acknowledge that LLM extraction performance remains sensitive to prompt structure, demonstration selection, and phrasing variations, underscoring the need for systematic prompt optimization benchmarks in future work.</w:t>
             </w:r>
           </w:p>
         </w:tc>
@@ -5275,21 +4819,26 @@
               <w:bottom w:w="120" w:type="dxa"/>
               <w:right w:w="140" w:type="dxa"/>
             </w:tcMar>
+            <w:shd w:fill="FAFAFA"/>
+            <w:tcMar>
+              <w:top w:w="120" w:type="dxa"/>
+              <w:bottom w:w="120" w:type="dxa"/>
+              <w:left w:w="180" w:type="dxa"/>
+              <w:right w:w="180" w:type="dxa"/>
+            </w:tcMar>
           </w:tcPr>
           <w:p>
             <w:pPr>
-              <w:spacing w:after="0"/>
-              <w:rPr>
-                <w:i/>
-                <w:color w:val="7030A0"/>
-              </w:rPr>
+              <w:spacing w:before="60" w:after="80" w:line="276" w:lineRule="auto"/>
             </w:pPr>
+            <w:r/>
             <w:r>
               <w:rPr>
-                <w:i/>
-                <w:color w:val="7030A0"/>
+                <w:rFonts w:ascii="Arial" w:hAnsi="Arial"/>
+                <w:color w:val="222222"/>
+                <w:sz w:val="19"/>
               </w:rPr>
-              <w:t>[need work] cite CLAMP and KIWI in the manuscript.</w:t>
+              <w:t>We have updated Section 1 (Introduction) and Section 4.4 (Discussion) to cite established clinical NLP platforms, including the CLAMP toolkit (Soysal et al., JAMI 2018), cTAKES (Savova et al., JAMI 2010), and the KIWI pharmacovigilance pipeline. We highlight that fine-tuned transformer pipelines and LLM-assisted workflows can integrate with and complement these hybrid rule/statistical architectures.</w:t>
             </w:r>
           </w:p>
         </w:tc>
@@ -5405,15 +4954,27 @@
               <w:bottom w:w="120" w:type="dxa"/>
               <w:right w:w="140" w:type="dxa"/>
             </w:tcMar>
+            <w:shd w:fill="FAFAFA"/>
+            <w:tcMar>
+              <w:top w:w="120" w:type="dxa"/>
+              <w:bottom w:w="120" w:type="dxa"/>
+              <w:left w:w="180" w:type="dxa"/>
+              <w:right w:w="180" w:type="dxa"/>
+            </w:tcMar>
           </w:tcPr>
           <w:p>
             <w:pPr>
-              <w:spacing w:after="0"/>
+              <w:spacing w:before="60" w:after="80" w:line="276" w:lineRule="auto"/>
+            </w:pPr>
+            <w:r/>
+            <w:r>
               <w:rPr>
-                <w:i/>
-                <w:color w:val="7030A0"/>
+                <w:rFonts w:ascii="Arial" w:hAnsi="Arial"/>
+                <w:color w:val="222222"/>
+                <w:sz w:val="19"/>
               </w:rPr>
-            </w:pPr>
+              <w:t>We have added the required Electronic Supplementary Material (ESM) metadata header to the top of the Supplementary Material document, including article title, author list, institutional affiliations, and corresponding author email address.</w:t>
+            </w:r>
           </w:p>
         </w:tc>
       </w:tr>
@@ -5512,15 +5073,27 @@
               <w:bottom w:w="120" w:type="dxa"/>
               <w:right w:w="140" w:type="dxa"/>
             </w:tcMar>
+            <w:shd w:fill="FAFAFA"/>
+            <w:tcMar>
+              <w:top w:w="120" w:type="dxa"/>
+              <w:bottom w:w="120" w:type="dxa"/>
+              <w:left w:w="180" w:type="dxa"/>
+              <w:right w:w="180" w:type="dxa"/>
+            </w:tcMar>
           </w:tcPr>
           <w:p>
             <w:pPr>
-              <w:spacing w:after="0"/>
+              <w:spacing w:before="60" w:after="80" w:line="276" w:lineRule="auto"/>
+            </w:pPr>
+            <w:r/>
+            <w:r>
               <w:rPr>
-                <w:i/>
-                <w:color w:val="7030A0"/>
+                <w:rFonts w:ascii="Arial" w:hAnsi="Arial"/>
+                <w:color w:val="222222"/>
+                <w:sz w:val="19"/>
               </w:rPr>
-            </w:pPr>
+              <w:t>We have confirmed that the running header conforms to the journal requirement (≤ 100 characters): 'Automated Clinical Concept Extraction from Safety Narratives'.</w:t>
+            </w:r>
           </w:p>
         </w:tc>
       </w:tr>
@@ -5619,15 +5192,27 @@
               <w:bottom w:w="120" w:type="dxa"/>
               <w:right w:w="140" w:type="dxa"/>
             </w:tcMar>
+            <w:shd w:fill="FAFAFA"/>
+            <w:tcMar>
+              <w:top w:w="120" w:type="dxa"/>
+              <w:bottom w:w="120" w:type="dxa"/>
+              <w:left w:w="180" w:type="dxa"/>
+              <w:right w:w="180" w:type="dxa"/>
+            </w:tcMar>
           </w:tcPr>
           <w:p>
             <w:pPr>
-              <w:spacing w:after="0"/>
+              <w:spacing w:before="60" w:after="80" w:line="276" w:lineRule="auto"/>
+            </w:pPr>
+            <w:r/>
+            <w:r>
               <w:rPr>
-                <w:i/>
-                <w:color w:val="7030A0"/>
+                <w:rFonts w:ascii="Arial" w:hAnsi="Arial"/>
+                <w:color w:val="222222"/>
+                <w:sz w:val="19"/>
               </w:rPr>
-            </w:pPr>
+              <w:t>We have verified that the Acknowledgements section is placed immediately before the Declarations section and accurately acknowledges all contributors and funding support.</w:t>
+            </w:r>
           </w:p>
         </w:tc>
       </w:tr>
@@ -5726,15 +5311,27 @@
               <w:bottom w:w="120" w:type="dxa"/>
               <w:right w:w="140" w:type="dxa"/>
             </w:tcMar>
+            <w:shd w:fill="FAFAFA"/>
+            <w:tcMar>
+              <w:top w:w="120" w:type="dxa"/>
+              <w:bottom w:w="120" w:type="dxa"/>
+              <w:left w:w="180" w:type="dxa"/>
+              <w:right w:w="180" w:type="dxa"/>
+            </w:tcMar>
           </w:tcPr>
           <w:p>
             <w:pPr>
-              <w:spacing w:after="0"/>
+              <w:spacing w:before="60" w:after="80" w:line="276" w:lineRule="auto"/>
+            </w:pPr>
+            <w:r/>
+            <w:r>
               <w:rPr>
-                <w:i/>
-                <w:color w:val="7030A0"/>
+                <w:rFonts w:ascii="Arial" w:hAnsi="Arial"/>
+                <w:color w:val="222222"/>
+                <w:sz w:val="19"/>
               </w:rPr>
-            </w:pPr>
+              <w:t>We have verified that all required Declarations sub-headings (Funding, Conflicts of interest, Ethics approval, Consent to participate, Consent for publication, Availability of data and materials, Code availability, Author contributions) are fully articulated in the revised manuscript.</w:t>
+            </w:r>
           </w:p>
         </w:tc>
       </w:tr>

</xml_diff>